<commit_message>
Agreement: ongoing monthly affiliate management with phases, 90-day kickstart, blank key-term boxes for e-sign
- Part 1: the five goals and three phases (reactivation kickoff, 90-day
  kickstart and review, 6-12 months of ongoing management, controlled
  community release)
- Part 2: Key terms table and signature boxes render as fixed empty boxes for
  SignWell/DocuSign fields; server and relationship-manager lines dropped
- proposal page carries the same goals and phases

Co-Authored-By: Claude Opus 5.5 <noreply@anthropic.com>
</commit_message>
<xml_diff>
--- a/docs/proposal-and-agreement-7ff.docx
+++ b/docs/proposal-and-agreement-7ff.docx
@@ -15,7 +15,7 @@
         <w:pStyle w:val="Subtitle"/>
       </w:pPr>
       <w:r>
-        <w:t xml:space="preserve">AI Funding Affiliate Manager for the 7 Figures Funding partner program</w:t>
+        <w:t xml:space="preserve">Affiliate management for the 7 Figures Funding partner program</w:t>
       </w:r>
     </w:p>
     <w:p>
@@ -68,7 +68,7 @@
         <w:t xml:space="preserve">September 23, 2026</w:t>
       </w:r>
     </w:p>
-    <w:bookmarkStart w:id="14" w:name="part-1-proposal"/>
+    <w:bookmarkStart w:id="15" w:name="part-1-proposal"/>
     <w:p>
       <w:pPr>
         <w:pStyle w:val="Heading1"/>
@@ -77,13 +77,13 @@
         <w:t xml:space="preserve">Part 1: Proposal</w:t>
       </w:r>
     </w:p>
-    <w:bookmarkStart w:id="9" w:name="what-well-do"/>
+    <w:bookmarkStart w:id="9" w:name="the-goal"/>
     <w:p>
       <w:pPr>
         <w:pStyle w:val="Heading2"/>
       </w:pPr>
       <w:r>
-        <w:t xml:space="preserve">What we’ll do</w:t>
+        <w:t xml:space="preserve">The goal</w:t>
       </w:r>
     </w:p>
     <w:p>
@@ -97,7 +97,7 @@
         <w:t xml:space="preserve">“7FF”</w:t>
       </w:r>
       <w:r>
-        <w:t xml:space="preserve">) has more than 13,000 partners, most of them in Zoho. About 50 are active and sending deals, which leaves roughly 12,950 who signed up and went quiet. We will bring them back into conversation and keep them sending deals, using an AI Funding Affiliate Manager that works inside GoHighLevel with a person approving what it sends.</w:t>
+        <w:t xml:space="preserve">) has more than 13,000 partners, most of them in Zoho. About 50 are active and sending deals, which leaves roughly 12,950 who signed up and went quiet. The reactivation text is only the start. The goal is a lasting relationship with every partner:</w:t>
       </w:r>
     </w:p>
     <w:p>
@@ -113,13 +113,13 @@
           <w:b/>
           <w:bCs/>
         </w:rPr>
-        <w:t xml:space="preserve">One personal text to every quiet partner.</w:t>
+        <w:t xml:space="preserve">Open the door</w:t>
       </w:r>
       <w:r>
         <w:t xml:space="preserve"> </w:t>
       </w:r>
       <w:r>
-        <w:t xml:space="preserve">Each kickoff is written for that partner from their own record (name, tier, last deal, niche), followed by a real back-and-forth with everyone who answers.</w:t>
+        <w:t xml:space="preserve">to a real relationship with each partner.</w:t>
       </w:r>
     </w:p>
     <w:p>
@@ -135,13 +135,13 @@
           <w:b/>
           <w:bCs/>
         </w:rPr>
-        <w:t xml:space="preserve">Every partner kept warm.</w:t>
+        <w:t xml:space="preserve">Build a partner profile</w:t>
       </w:r>
       <w:r>
         <w:t xml:space="preserve"> </w:t>
       </w:r>
       <w:r>
-        <w:t xml:space="preserve">A touch every two weeks, an offer once a month, a newsletter, and regular partner trainings.</w:t>
+        <w:t xml:space="preserve">for each one: tier, history, niche, goals, and every conversation.</w:t>
       </w:r>
     </w:p>
     <w:p>
@@ -157,19 +157,13 @@
           <w:b/>
           <w:bCs/>
         </w:rPr>
-        <w:t xml:space="preserve">Follow-ups on the day promised.</w:t>
+        <w:t xml:space="preserve">Know each partner.</w:t>
       </w:r>
       <w:r>
         <w:t xml:space="preserve"> </w:t>
       </w:r>
       <w:r>
-        <w:t xml:space="preserve">“Check back with me”</w:t>
-      </w:r>
-      <w:r>
-        <w:t xml:space="preserve"> </w:t>
-      </w:r>
-      <w:r>
-        <w:t xml:space="preserve">becomes a task on the right day. A partner with a deal gets a person on the phone the same day.</w:t>
+        <w:t xml:space="preserve">The agent learns each partner’s specifics from their profile and every conversation, so every message fits that person.</w:t>
       </w:r>
     </w:p>
     <w:p>
@@ -185,13 +179,13 @@
           <w:b/>
           <w:bCs/>
         </w:rPr>
-        <w:t xml:space="preserve">Deals counted by tier.</w:t>
+        <w:t xml:space="preserve">Plan a revenue channel.</w:t>
       </w:r>
       <w:r>
         <w:t xml:space="preserve"> </w:t>
       </w:r>
       <w:r>
-        <w:t xml:space="preserve">Every re-engaged partner is tagged with their tier, so each deal they send is counted against the right share.</w:t>
+        <w:t xml:space="preserve">For every partner who engages, a plan for turning them into a steady source of deals.</w:t>
       </w:r>
     </w:p>
     <w:p>
@@ -207,17 +201,219 @@
           <w:b/>
           <w:bCs/>
         </w:rPr>
-        <w:t xml:space="preserve">A weekly scorecard.</w:t>
+        <w:t xml:space="preserve">Coach the community.</w:t>
       </w:r>
       <w:r>
         <w:t xml:space="preserve"> </w:t>
       </w:r>
       <w:r>
+        <w:t xml:space="preserve">In time, offer affiliate coaching in the group, helping members grow their own affiliate and referral programs.</w:t>
+      </w:r>
+    </w:p>
+    <w:bookmarkEnd w:id="9"/>
+    <w:bookmarkStart w:id="10" w:name="how-it-unfolds"/>
+    <w:p>
+      <w:pPr>
+        <w:pStyle w:val="Heading2"/>
+      </w:pPr>
+      <w:r>
+        <w:t xml:space="preserve">How it unfolds</w:t>
+      </w:r>
+    </w:p>
+    <w:p>
+      <w:pPr>
+        <w:pStyle w:val="Compact"/>
+        <w:numPr>
+          <w:ilvl w:val="0"/>
+          <w:numId w:val="1002"/>
+        </w:numPr>
+      </w:pPr>
+      <w:r>
+        <w:rPr>
+          <w:b/>
+          <w:bCs/>
+        </w:rPr>
+        <w:t xml:space="preserve">Phase 1: Reactivation kickoff, starting this month.</w:t>
+      </w:r>
+      <w:r>
+        <w:t xml:space="preserve"> </w:t>
+      </w:r>
+      <w:r>
+        <w:t xml:space="preserve">One personal text to each quiet partner, written from their own record, then a real back-and-forth with everyone who answers. It starts with a pilot of 250 partners, then 2,500, then the remaining 10,200. Each wave opens only when the one before it has worked: low opt-outs, a healthy texting number, conversations 7FF is happy with, deals counted by tier, and AI spend on track.</w:t>
+      </w:r>
+    </w:p>
+    <w:p>
+      <w:pPr>
+        <w:pStyle w:val="Compact"/>
+        <w:numPr>
+          <w:ilvl w:val="0"/>
+          <w:numId w:val="1002"/>
+        </w:numPr>
+      </w:pPr>
+      <w:r>
+        <w:rPr>
+          <w:b/>
+          <w:bCs/>
+        </w:rPr>
+        <w:t xml:space="preserve">Phase 2: The 90-day kickstart.</w:t>
+      </w:r>
+      <w:r>
+        <w:t xml:space="preserve"> </w:t>
+      </w:r>
+      <w:r>
+        <w:t xml:space="preserve">Relationships and replies take time. Over the first 90 days we build each partner’s profile, learn each partner from every conversation, and put a revenue plan in place for every partner who engages. At day 90 we review the results together, with real data, and decide where to push.</w:t>
+      </w:r>
+    </w:p>
+    <w:p>
+      <w:pPr>
+        <w:pStyle w:val="Compact"/>
+        <w:numPr>
+          <w:ilvl w:val="0"/>
+          <w:numId w:val="1002"/>
+        </w:numPr>
+      </w:pPr>
+      <w:r>
+        <w:rPr>
+          <w:b/>
+          <w:bCs/>
+        </w:rPr>
+        <w:t xml:space="preserve">Phase 3: Ongoing affiliate management, over 6 to 12 months.</w:t>
+      </w:r>
+      <w:r>
+        <w:t xml:space="preserve"> </w:t>
+      </w:r>
+      <w:r>
+        <w:t xml:space="preserve">Every partner stays on a steady relationship cadence, and revenue compounds as more partners come back and keep sending deals. We refine the program together, then release it to the whole community in a controlled way.</w:t>
+      </w:r>
+    </w:p>
+    <w:bookmarkEnd w:id="10"/>
+    <w:bookmarkStart w:id="11" w:name="X1bff506bba1118ada793f4d1322672a6b2566df"/>
+    <w:p>
+      <w:pPr>
+        <w:pStyle w:val="Heading2"/>
+      </w:pPr>
+      <w:r>
+        <w:t xml:space="preserve">What the affiliate manager does every month</w:t>
+      </w:r>
+    </w:p>
+    <w:p>
+      <w:pPr>
+        <w:pStyle w:val="Compact"/>
+        <w:numPr>
+          <w:ilvl w:val="0"/>
+          <w:numId w:val="1003"/>
+        </w:numPr>
+      </w:pPr>
+      <w:r>
+        <w:rPr>
+          <w:b/>
+          <w:bCs/>
+        </w:rPr>
+        <w:t xml:space="preserve">Keeps every partner warm.</w:t>
+      </w:r>
+      <w:r>
+        <w:t xml:space="preserve"> </w:t>
+      </w:r>
+      <w:r>
+        <w:t xml:space="preserve">A touch every two weeks, an offer once a month, a newsletter, and regular partner trainings.</w:t>
+      </w:r>
+    </w:p>
+    <w:p>
+      <w:pPr>
+        <w:pStyle w:val="Compact"/>
+        <w:numPr>
+          <w:ilvl w:val="0"/>
+          <w:numId w:val="1003"/>
+        </w:numPr>
+      </w:pPr>
+      <w:r>
+        <w:rPr>
+          <w:b/>
+          <w:bCs/>
+        </w:rPr>
+        <w:t xml:space="preserve">Follows up on the day promised.</w:t>
+      </w:r>
+      <w:r>
+        <w:t xml:space="preserve"> </w:t>
+      </w:r>
+      <w:r>
+        <w:t xml:space="preserve">“Check back with me”</w:t>
+      </w:r>
+      <w:r>
+        <w:t xml:space="preserve"> </w:t>
+      </w:r>
+      <w:r>
+        <w:t xml:space="preserve">becomes a task on the right day. A partner with a deal gets a person on the phone the same day.</w:t>
+      </w:r>
+    </w:p>
+    <w:p>
+      <w:pPr>
+        <w:pStyle w:val="Compact"/>
+        <w:numPr>
+          <w:ilvl w:val="0"/>
+          <w:numId w:val="1003"/>
+        </w:numPr>
+      </w:pPr>
+      <w:r>
+        <w:rPr>
+          <w:b/>
+          <w:bCs/>
+        </w:rPr>
+        <w:t xml:space="preserve">Keeps every profile current.</w:t>
+      </w:r>
+      <w:r>
+        <w:t xml:space="preserve"> </w:t>
+      </w:r>
+      <w:r>
+        <w:t xml:space="preserve">Each conversation updates the partner’s profile, so the next message builds on the last.</w:t>
+      </w:r>
+    </w:p>
+    <w:p>
+      <w:pPr>
+        <w:pStyle w:val="Compact"/>
+        <w:numPr>
+          <w:ilvl w:val="0"/>
+          <w:numId w:val="1003"/>
+        </w:numPr>
+      </w:pPr>
+      <w:r>
+        <w:rPr>
+          <w:b/>
+          <w:bCs/>
+        </w:rPr>
+        <w:t xml:space="preserve">Counts deals by tier.</w:t>
+      </w:r>
+      <w:r>
+        <w:t xml:space="preserve"> </w:t>
+      </w:r>
+      <w:r>
+        <w:t xml:space="preserve">Every re-engaged partner is tagged with their tier, so each deal they send is counted against the right share.</w:t>
+      </w:r>
+    </w:p>
+    <w:p>
+      <w:pPr>
+        <w:pStyle w:val="Compact"/>
+        <w:numPr>
+          <w:ilvl w:val="0"/>
+          <w:numId w:val="1003"/>
+        </w:numPr>
+      </w:pPr>
+      <w:r>
+        <w:rPr>
+          <w:b/>
+          <w:bCs/>
+        </w:rPr>
+        <w:t xml:space="preserve">Reports weekly.</w:t>
+      </w:r>
+      <w:r>
+        <w:t xml:space="preserve"> </w:t>
+      </w:r>
+      <w:r>
         <w:t xml:space="preserve">Replies, opt-outs, deals by tier, and AI spend against the budget.</w:t>
       </w:r>
     </w:p>
-    <w:bookmarkEnd w:id="9"/>
-    <w:bookmarkStart w:id="10" w:name="how-its-paid-for-usage-plus-performance"/>
+    <w:bookmarkEnd w:id="11"/>
+    <w:bookmarkStart w:id="12" w:name="how-its-paid-for-usage-plus-performance"/>
     <w:p>
       <w:pPr>
         <w:pStyle w:val="Heading2"/>
@@ -231,7 +427,7 @@
         <w:pStyle w:val="FirstParagraph"/>
       </w:pPr>
       <w:r>
-        <w:t xml:space="preserve">There is no monthly fee. 7FF pays the AI and texting usage at cost, with no markup. We earn a share of each deal from a partner we bring back, set by that partner’s tier:</w:t>
+        <w:t xml:space="preserve">There is no monthly fee. 7FF covers the AI and texting usage at cost, with no markup. We earn a share of each deal from a partner we bring back, set by that partner’s tier, so our return grows only as 7FF’s does:</w:t>
       </w:r>
     </w:p>
     <w:tbl>
@@ -368,8 +564,8 @@
         </w:tc>
       </w:tr>
     </w:tbl>
-    <w:bookmarkEnd w:id="10"/>
-    <w:bookmarkStart w:id="11" w:name="what-it-costs-to-run"/>
+    <w:bookmarkEnd w:id="12"/>
+    <w:bookmarkStart w:id="13" w:name="what-it-costs-to-run"/>
     <w:p>
       <w:pPr>
         <w:pStyle w:val="Heading2"/>
@@ -559,26 +755,8 @@
         <w:t xml:space="preserve">The reactivation covers a personal kickoff text to each of the 12,950 inactive partners and every conversation that follows. The monthly figures keep all 13,000 partners on the two-week cadence. Texting is billed by HighLevel on 7FF’s own sub-account.</w:t>
       </w:r>
     </w:p>
-    <w:bookmarkEnd w:id="11"/>
-    <w:bookmarkStart w:id="12" w:name="how-we-roll-it-out"/>
-    <w:p>
-      <w:pPr>
-        <w:pStyle w:val="Heading2"/>
-      </w:pPr>
-      <w:r>
-        <w:t xml:space="preserve">How we roll it out</w:t>
-      </w:r>
-    </w:p>
-    <w:p>
-      <w:pPr>
-        <w:pStyle w:val="FirstParagraph"/>
-      </w:pPr>
-      <w:r>
-        <w:t xml:space="preserve">In waves, each opened only when the one before it has worked: a pilot of 250 partners, then 2,500, then the remaining 10,200. Between waves we check that opt-outs are low, the texting number is in good standing with the carriers, 7FF is happy with the tone of the conversations, deals are being counted by tier, and AI spend is tracking the projection.</w:t>
-      </w:r>
-    </w:p>
-    <w:bookmarkEnd w:id="12"/>
-    <w:bookmarkStart w:id="13" w:name="what-we-need-from-7ff"/>
+    <w:bookmarkEnd w:id="13"/>
+    <w:bookmarkStart w:id="14" w:name="what-we-need-from-7ff"/>
     <w:p>
       <w:pPr>
         <w:pStyle w:val="Heading2"/>
@@ -592,7 +770,7 @@
         <w:pStyle w:val="Compact"/>
         <w:numPr>
           <w:ilvl w:val="0"/>
-          <w:numId w:val="1002"/>
+          <w:numId w:val="1004"/>
         </w:numPr>
       </w:pPr>
       <w:r>
@@ -604,7 +782,7 @@
         <w:pStyle w:val="Compact"/>
         <w:numPr>
           <w:ilvl w:val="0"/>
-          <w:numId w:val="1002"/>
+          <w:numId w:val="1004"/>
         </w:numPr>
       </w:pPr>
       <w:r>
@@ -616,7 +794,7 @@
         <w:pStyle w:val="Compact"/>
         <w:numPr>
           <w:ilvl w:val="0"/>
-          <w:numId w:val="1002"/>
+          <w:numId w:val="1004"/>
         </w:numPr>
       </w:pPr>
       <w:r>
@@ -628,7 +806,7 @@
         <w:pStyle w:val="Compact"/>
         <w:numPr>
           <w:ilvl w:val="0"/>
-          <w:numId w:val="1002"/>
+          <w:numId w:val="1004"/>
         </w:numPr>
       </w:pPr>
       <w:r>
@@ -640,7 +818,7 @@
         <w:pStyle w:val="Compact"/>
         <w:numPr>
           <w:ilvl w:val="0"/>
-          <w:numId w:val="1002"/>
+          <w:numId w:val="1004"/>
         </w:numPr>
       </w:pPr>
       <w:r>
@@ -652,7 +830,7 @@
         <w:pStyle w:val="Compact"/>
         <w:numPr>
           <w:ilvl w:val="0"/>
-          <w:numId w:val="1002"/>
+          <w:numId w:val="1004"/>
         </w:numPr>
       </w:pPr>
       <w:r>
@@ -664,16 +842,16 @@
         <w:pStyle w:val="Compact"/>
         <w:numPr>
           <w:ilvl w:val="0"/>
-          <w:numId w:val="1002"/>
+          <w:numId w:val="1004"/>
         </w:numPr>
       </w:pPr>
       <w:r>
         <w:t xml:space="preserve">The deal records used to calculate our share</w:t>
       </w:r>
     </w:p>
-    <w:bookmarkEnd w:id="13"/>
     <w:bookmarkEnd w:id="14"/>
-    <w:bookmarkStart w:id="30" w:name="part-2-agreement"/>
+    <w:bookmarkEnd w:id="15"/>
+    <w:bookmarkStart w:id="33" w:name="part-2-agreement"/>
     <w:p>
       <w:pPr>
         <w:pStyle w:val="Heading1"/>
@@ -687,146 +865,217 @@
         <w:pStyle w:val="FirstParagraph"/>
       </w:pPr>
       <w:r>
-        <w:t xml:space="preserve">This Agreement is between</w:t>
+        <w:t xml:space="preserve">This Agreement is between the 7FF entity and the Provider entity named in the Key terms below. It takes effect on the date of the last signature below (the</w:t>
       </w:r>
       <w:r>
         <w:t xml:space="preserve"> </w:t>
       </w:r>
       <w:r>
-        <w:rPr>
-          <w:b/>
-          <w:bCs/>
-        </w:rPr>
-        <w:t xml:space="preserve">[7FF legal entity name]</w:t>
-      </w:r>
-      <w:r>
-        <w:t xml:space="preserve">, a [state] [entity type] (</w:t>
-      </w:r>
-      <w:r>
-        <w:t xml:space="preserve">“7FF”</w:t>
-      </w:r>
-      <w:r>
-        <w:t xml:space="preserve">), and</w:t>
+        <w:t xml:space="preserve">“Effective Date”</w:t>
+      </w:r>
+      <w:r>
+        <w:t xml:space="preserve">).</w:t>
+      </w:r>
+    </w:p>
+    <w:bookmarkStart w:id="16" w:name="key-terms"/>
+    <w:p>
+      <w:pPr>
+        <w:pStyle w:val="Heading2"/>
+      </w:pPr>
+      <w:r>
+        <w:t xml:space="preserve">Key terms</w:t>
+      </w:r>
+    </w:p>
+    <w:tbl>
+      <w:tblPr>
+        <w:tblStyle w:val="Table"/>
+        <w:tblW w:type="pct" w:w="5000"/>
+        <w:tblLayout w:type="fixed"/>
+        <w:tblLook w:firstRow="1" w:lastRow="0" w:firstColumn="0" w:lastColumn="0" w:noHBand="0" w:noVBand="0" w:val="0020"/>
+      </w:tblPr>
+      <w:tblGrid>
+        <w:gridCol w:w="3960"/>
+        <w:gridCol w:w="3960"/>
+      </w:tblGrid>
+      <w:tr>
+        <w:trPr>
+          <w:tblHeader w:val="on"/>
+        </w:trPr>
+        <w:tc>
+          <w:tcPr/>
+          <w:p>
+            <w:pPr>
+              <w:pStyle w:val="Compact"/>
+            </w:pPr>
+            <w:r>
+              <w:t xml:space="preserve">Term</w:t>
+            </w:r>
+          </w:p>
+        </w:tc>
+        <w:tc>
+          <w:tcPr/>
+          <w:p>
+            <w:pPr>
+              <w:pStyle w:val="Compact"/>
+            </w:pPr>
+            <w:r>
+              <w:t xml:space="preserve">Entry</w:t>
+            </w:r>
+          </w:p>
+        </w:tc>
+      </w:tr>
+      <w:tr>
+        <w:tc>
+          <w:tcPr/>
+          <w:p>
+            <w:pPr>
+              <w:pStyle w:val="Compact"/>
+            </w:pPr>
+            <w:r>
+              <w:t xml:space="preserve">7FF legal entity (name, state, entity type)</w:t>
+            </w:r>
+          </w:p>
+        </w:tc>
+        <w:tc>
+          <w:tcPr/>
+          <w:p>
+            <w:pPr>
+              <w:pStyle w:val="Compact"/>
+            </w:pPr>
+          </w:p>
+        </w:tc>
+      </w:tr>
+      <w:tr>
+        <w:tc>
+          <w:tcPr/>
+          <w:p>
+            <w:pPr>
+              <w:pStyle w:val="Compact"/>
+            </w:pPr>
+            <w:r>
+              <w:t xml:space="preserve">Provider legal entity (name, state, entity type)</w:t>
+            </w:r>
+          </w:p>
+        </w:tc>
+        <w:tc>
+          <w:tcPr/>
+          <w:p>
+            <w:pPr>
+              <w:pStyle w:val="Compact"/>
+            </w:pPr>
+          </w:p>
+        </w:tc>
+      </w:tr>
+      <w:tr>
+        <w:tc>
+          <w:tcPr/>
+          <w:p>
+            <w:pPr>
+              <w:pStyle w:val="Compact"/>
+            </w:pPr>
+            <w:r>
+              <w:t xml:space="preserve">The performance share is calculated on</w:t>
+            </w:r>
+          </w:p>
+        </w:tc>
+        <w:tc>
+          <w:tcPr/>
+          <w:p>
+            <w:pPr>
+              <w:pStyle w:val="Compact"/>
+            </w:pPr>
+          </w:p>
+        </w:tc>
+      </w:tr>
+      <w:tr>
+        <w:tc>
+          <w:tcPr/>
+          <w:p>
+            <w:pPr>
+              <w:pStyle w:val="Compact"/>
+            </w:pPr>
+            <w:r>
+              <w:t xml:space="preserve">Months a Re-engaged Partner’s deals count after their first reply</w:t>
+            </w:r>
+          </w:p>
+        </w:tc>
+        <w:tc>
+          <w:tcPr/>
+          <w:p>
+            <w:pPr>
+              <w:pStyle w:val="Compact"/>
+            </w:pPr>
+          </w:p>
+        </w:tc>
+      </w:tr>
+      <w:tr>
+        <w:tc>
+          <w:tcPr/>
+          <w:p>
+            <w:pPr>
+              <w:pStyle w:val="Compact"/>
+            </w:pPr>
+            <w:r>
+              <w:t xml:space="preserve">Funding Machine purchases by Re-engaged Partners count at (%, or 0)</w:t>
+            </w:r>
+          </w:p>
+        </w:tc>
+        <w:tc>
+          <w:tcPr/>
+          <w:p>
+            <w:pPr>
+              <w:pStyle w:val="Compact"/>
+            </w:pPr>
+          </w:p>
+        </w:tc>
+      </w:tr>
+      <w:tr>
+        <w:tc>
+          <w:tcPr/>
+          <w:p>
+            <w:pPr>
+              <w:pStyle w:val="Compact"/>
+            </w:pPr>
+            <w:r>
+              <w:t xml:space="preserve">Governing law (state)</w:t>
+            </w:r>
+          </w:p>
+        </w:tc>
+        <w:tc>
+          <w:tcPr/>
+          <w:p>
+            <w:pPr>
+              <w:pStyle w:val="Compact"/>
+            </w:pPr>
+          </w:p>
+        </w:tc>
+      </w:tr>
+    </w:tbl>
+    <w:bookmarkEnd w:id="16"/>
+    <w:bookmarkStart w:id="17" w:name="services"/>
+    <w:p>
+      <w:pPr>
+        <w:pStyle w:val="Heading2"/>
+      </w:pPr>
+      <w:r>
+        <w:t xml:space="preserve">1. Services</w:t>
+      </w:r>
+    </w:p>
+    <w:p>
+      <w:pPr>
+        <w:pStyle w:val="FirstParagraph"/>
+      </w:pPr>
+      <w:r>
+        <w:t xml:space="preserve">Provider will act as the affiliate manager for 7FF’s partner program each month (the</w:t>
       </w:r>
       <w:r>
         <w:t xml:space="preserve"> </w:t>
       </w:r>
       <w:r>
-        <w:rPr>
-          <w:b/>
-          <w:bCs/>
-        </w:rPr>
-        <w:t xml:space="preserve">[Provider legal entity name]</w:t>
-      </w:r>
-      <w:r>
-        <w:t xml:space="preserve">, a [state] [entity type] (</w:t>
-      </w:r>
-      <w:r>
-        <w:t xml:space="preserve">“Provider”</w:t>
-      </w:r>
-      <w:r>
-        <w:t xml:space="preserve">). It takes effect on the date of the last signature below (the</w:t>
-      </w:r>
-      <w:r>
-        <w:t xml:space="preserve"> </w:t>
-      </w:r>
-      <w:r>
-        <w:t xml:space="preserve">“Effective Date”</w:t>
-      </w:r>
-      <w:r>
-        <w:t xml:space="preserve">).</w:t>
-      </w:r>
-    </w:p>
-    <w:bookmarkStart w:id="15" w:name="services"/>
-    <w:p>
-      <w:pPr>
-        <w:pStyle w:val="Heading2"/>
-      </w:pPr>
-      <w:r>
-        <w:t xml:space="preserve">1. Services</w:t>
-      </w:r>
-    </w:p>
-    <w:p>
-      <w:pPr>
-        <w:pStyle w:val="FirstParagraph"/>
-      </w:pPr>
-      <w:r>
-        <w:t xml:space="preserve">Provider will run a partner reactivation and relationship program for 7FF’s inactive partners (the</w:t>
-      </w:r>
-      <w:r>
-        <w:t xml:space="preserve"> </w:t>
-      </w:r>
-      <w:r>
         <w:t xml:space="preserve">“Program”</w:t>
       </w:r>
       <w:r>
-        <w:t xml:space="preserve">), as described in Part 1. This includes the AI Funding Affiliate Manager, the GoHighLevel build, the reactivation outreach, ongoing relationship touches, reply handling, and the weekly scorecard. Provider may use its own staff, contractors and software to deliver the Services.</w:t>
-      </w:r>
-    </w:p>
-    <w:bookmarkEnd w:id="15"/>
-    <w:bookmarkStart w:id="16" w:name="rollout"/>
-    <w:p>
-      <w:pPr>
-        <w:pStyle w:val="Heading2"/>
-      </w:pPr>
-      <w:r>
-        <w:t xml:space="preserve">2. Rollout</w:t>
-      </w:r>
-    </w:p>
-    <w:p>
-      <w:pPr>
-        <w:pStyle w:val="FirstParagraph"/>
-      </w:pPr>
-      <w:r>
-        <w:t xml:space="preserve">The Program starts with a pilot of 250 partners and continues in waves. The parties will agree the pilot’s measures of success in writing (email is enough) before it begins, and a new wave starts only when the previous wave meets them.</w:t>
-      </w:r>
-    </w:p>
-    <w:bookmarkEnd w:id="16"/>
-    <w:bookmarkStart w:id="17" w:name="what-7ff-provides"/>
-    <w:p>
-      <w:pPr>
-        <w:pStyle w:val="Heading2"/>
-      </w:pPr>
-      <w:r>
-        <w:t xml:space="preserve">3. What 7FF provides</w:t>
-      </w:r>
-    </w:p>
-    <w:p>
-      <w:pPr>
-        <w:pStyle w:val="FirstParagraph"/>
-      </w:pPr>
-      <w:r>
-        <w:t xml:space="preserve">7FF will provide the items listed under</w:t>
-      </w:r>
-      <w:r>
-        <w:t xml:space="preserve"> </w:t>
-      </w:r>
-      <w:r>
-        <w:t xml:space="preserve">“What we need from 7FF”</w:t>
-      </w:r>
-      <w:r>
-        <w:t xml:space="preserve"> </w:t>
-      </w:r>
-      <w:r>
-        <w:t xml:space="preserve">in Part 1. 7FF confirms that the partners it puts in scope for texting have agreed to receive texts from 7FF, and will tell Provider about any partner who has not.</w:t>
-      </w:r>
-    </w:p>
-    <w:bookmarkEnd w:id="17"/>
-    <w:bookmarkStart w:id="18" w:name="usage-costs"/>
-    <w:p>
-      <w:pPr>
-        <w:pStyle w:val="Heading2"/>
-      </w:pPr>
-      <w:r>
-        <w:t xml:space="preserve">4. Usage costs</w:t>
-      </w:r>
-    </w:p>
-    <w:p>
-      <w:pPr>
-        <w:pStyle w:val="FirstParagraph"/>
-      </w:pPr>
-      <w:r>
-        <w:t xml:space="preserve">7FF pays the costs of running the Program at cost, with no markup:</w:t>
+        <w:t xml:space="preserve">), as described in Part 1. The Services include:</w:t>
       </w:r>
     </w:p>
     <w:p>
@@ -834,7 +1083,141 @@
         <w:pStyle w:val="Compact"/>
         <w:numPr>
           <w:ilvl w:val="0"/>
-          <w:numId w:val="1003"/>
+          <w:numId w:val="1005"/>
+        </w:numPr>
+      </w:pPr>
+      <w:r>
+        <w:t xml:space="preserve">Phase 1, the reactivation kickoff for 7FF’s inactive partners;</w:t>
+      </w:r>
+    </w:p>
+    <w:p>
+      <w:pPr>
+        <w:pStyle w:val="Compact"/>
+        <w:numPr>
+          <w:ilvl w:val="0"/>
+          <w:numId w:val="1005"/>
+        </w:numPr>
+      </w:pPr>
+      <w:r>
+        <w:t xml:space="preserve">a partner profile for each partner in 7FF’s GoHighLevel, kept current;</w:t>
+      </w:r>
+    </w:p>
+    <w:p>
+      <w:pPr>
+        <w:pStyle w:val="Compact"/>
+        <w:numPr>
+          <w:ilvl w:val="0"/>
+          <w:numId w:val="1005"/>
+        </w:numPr>
+      </w:pPr>
+      <w:r>
+        <w:t xml:space="preserve">an ongoing relationship cadence, reply handling and follow-ups, run by the AI Funding Affiliate Manager under human approval;</w:t>
+      </w:r>
+    </w:p>
+    <w:p>
+      <w:pPr>
+        <w:pStyle w:val="Compact"/>
+        <w:numPr>
+          <w:ilvl w:val="0"/>
+          <w:numId w:val="1005"/>
+        </w:numPr>
+      </w:pPr>
+      <w:r>
+        <w:t xml:space="preserve">a revenue plan for each partner who engages; and</w:t>
+      </w:r>
+    </w:p>
+    <w:p>
+      <w:pPr>
+        <w:pStyle w:val="Compact"/>
+        <w:numPr>
+          <w:ilvl w:val="0"/>
+          <w:numId w:val="1005"/>
+        </w:numPr>
+      </w:pPr>
+      <w:r>
+        <w:t xml:space="preserve">a weekly scorecard.</w:t>
+      </w:r>
+    </w:p>
+    <w:p>
+      <w:pPr>
+        <w:pStyle w:val="FirstParagraph"/>
+      </w:pPr>
+      <w:r>
+        <w:t xml:space="preserve">Provider may use its own staff, contractors and software to deliver the Services.</w:t>
+      </w:r>
+    </w:p>
+    <w:bookmarkEnd w:id="17"/>
+    <w:bookmarkStart w:id="18" w:name="rollout"/>
+    <w:p>
+      <w:pPr>
+        <w:pStyle w:val="Heading2"/>
+      </w:pPr>
+      <w:r>
+        <w:t xml:space="preserve">2. Rollout</w:t>
+      </w:r>
+    </w:p>
+    <w:p>
+      <w:pPr>
+        <w:pStyle w:val="FirstParagraph"/>
+      </w:pPr>
+      <w:r>
+        <w:t xml:space="preserve">The reactivation starts with a pilot of 250 partners and continues in waves. The parties will agree the pilot’s measures of success in writing (email is enough) before it begins, and a new wave starts only when the previous wave meets them.</w:t>
+      </w:r>
+    </w:p>
+    <w:bookmarkEnd w:id="18"/>
+    <w:bookmarkStart w:id="19" w:name="what-7ff-provides"/>
+    <w:p>
+      <w:pPr>
+        <w:pStyle w:val="Heading2"/>
+      </w:pPr>
+      <w:r>
+        <w:t xml:space="preserve">3. What 7FF provides</w:t>
+      </w:r>
+    </w:p>
+    <w:p>
+      <w:pPr>
+        <w:pStyle w:val="FirstParagraph"/>
+      </w:pPr>
+      <w:r>
+        <w:t xml:space="preserve">7FF will provide the items listed under</w:t>
+      </w:r>
+      <w:r>
+        <w:t xml:space="preserve"> </w:t>
+      </w:r>
+      <w:r>
+        <w:t xml:space="preserve">“What we need from 7FF”</w:t>
+      </w:r>
+      <w:r>
+        <w:t xml:space="preserve"> </w:t>
+      </w:r>
+      <w:r>
+        <w:t xml:space="preserve">in Part 1. 7FF confirms that the partners it puts in scope for texting have agreed to receive texts from 7FF, and will tell Provider about any partner who has not.</w:t>
+      </w:r>
+    </w:p>
+    <w:bookmarkEnd w:id="19"/>
+    <w:bookmarkStart w:id="20" w:name="usage-costs"/>
+    <w:p>
+      <w:pPr>
+        <w:pStyle w:val="Heading2"/>
+      </w:pPr>
+      <w:r>
+        <w:t xml:space="preserve">4. Usage costs</w:t>
+      </w:r>
+    </w:p>
+    <w:p>
+      <w:pPr>
+        <w:pStyle w:val="FirstParagraph"/>
+      </w:pPr>
+      <w:r>
+        <w:t xml:space="preserve">7FF pays the usage costs of running the Program at cost, with no markup:</w:t>
+      </w:r>
+    </w:p>
+    <w:p>
+      <w:pPr>
+        <w:pStyle w:val="Compact"/>
+        <w:numPr>
+          <w:ilvl w:val="0"/>
+          <w:numId w:val="1006"/>
         </w:numPr>
       </w:pPr>
       <w:r>
@@ -856,7 +1239,7 @@
         <w:pStyle w:val="Compact"/>
         <w:numPr>
           <w:ilvl w:val="0"/>
-          <w:numId w:val="1003"/>
+          <w:numId w:val="1006"/>
         </w:numPr>
       </w:pPr>
       <w:r>
@@ -873,52 +1256,8 @@
         <w:t xml:space="preserve">HighLevel bills texting and A2P 10DLC registration fees to 7FF’s GoHighLevel sub-account directly.</w:t>
       </w:r>
     </w:p>
-    <w:p>
-      <w:pPr>
-        <w:pStyle w:val="Compact"/>
-        <w:numPr>
-          <w:ilvl w:val="0"/>
-          <w:numId w:val="1003"/>
-        </w:numPr>
-      </w:pPr>
-      <w:r>
-        <w:rPr>
-          <w:b/>
-          <w:bCs/>
-        </w:rPr>
-        <w:t xml:space="preserve">Server and the agent’s cloud computer:</w:t>
-      </w:r>
-      <w:r>
-        <w:t xml:space="preserve"> </w:t>
-      </w:r>
-      <w:r>
-        <w:t xml:space="preserve">[covered by Provider] or [billed at cost, up to $______ a month].</w:t>
-      </w:r>
-    </w:p>
-    <w:p>
-      <w:pPr>
-        <w:pStyle w:val="Compact"/>
-        <w:numPr>
-          <w:ilvl w:val="0"/>
-          <w:numId w:val="1003"/>
-        </w:numPr>
-      </w:pPr>
-      <w:r>
-        <w:rPr>
-          <w:b/>
-          <w:bCs/>
-        </w:rPr>
-        <w:t xml:space="preserve">Relationship manager:</w:t>
-      </w:r>
-      <w:r>
-        <w:t xml:space="preserve"> </w:t>
-      </w:r>
-      <w:r>
-        <w:t xml:space="preserve">[included in Provider’s share] or [$______ a month].</w:t>
-      </w:r>
-    </w:p>
-    <w:bookmarkEnd w:id="18"/>
-    <w:bookmarkStart w:id="19" w:name="performance-share"/>
+    <w:bookmarkEnd w:id="20"/>
+    <w:bookmarkStart w:id="21" w:name="performance-share"/>
     <w:p>
       <w:pPr>
         <w:pStyle w:val="Heading2"/>
@@ -932,7 +1271,7 @@
         <w:pStyle w:val="FirstParagraph"/>
       </w:pPr>
       <w:r>
-        <w:t xml:space="preserve">For each deal submitted by a Re-engaged Partner, 7FF pays Provider a share of [basis, for example 7FF’s revenue on the funded deal], set by that partner’s tier on the date the deal is submitted:</w:t>
+        <w:t xml:space="preserve">For each deal submitted by a Re-engaged Partner, 7FF pays Provider the share below of the amount named in the Key terms, set by that partner’s tier on the date the deal is submitted:</w:t>
       </w:r>
     </w:p>
     <w:tbl>
@@ -1090,11 +1429,11 @@
         <w:t xml:space="preserve"> </w:t>
       </w:r>
       <w:r>
-        <w:t xml:space="preserve">is a partner who was inactive on the Effective Date and who replies to the Program’s outreach. A deal counts if it is submitted within [______ months] of that partner’s first reply. A Re-engaged Partner’s purchase of the Funding Machine [counts at ______%] or [does not count].</w:t>
-      </w:r>
-    </w:p>
-    <w:bookmarkEnd w:id="19"/>
-    <w:bookmarkStart w:id="20" w:name="reporting-and-payment"/>
+        <w:t xml:space="preserve">is a partner who was inactive on the Effective Date and who replies to the Program’s outreach. A deal counts if it is submitted within the number of months in the Key terms after that partner’s first reply. A Re-engaged Partner’s purchase of the Funding Machine counts at the percentage in the Key terms.</w:t>
+      </w:r>
+    </w:p>
+    <w:bookmarkEnd w:id="21"/>
+    <w:bookmarkStart w:id="22" w:name="reporting-and-payment"/>
     <w:p>
       <w:pPr>
         <w:pStyle w:val="Heading2"/>
@@ -1111,8 +1450,8 @@
         <w:t xml:space="preserve">Provider sends a weekly scorecard. Within 10 days after each month ends, 7FF sends Provider the deals submitted and funded that month by Re-engaged Partners, with each partner’s tier. Provider then invoices the performance share and the month’s AI usage together, and 7FF pays within 15 days of the invoice. Each party may review the other’s records behind an invoice on reasonable notice.</w:t>
       </w:r>
     </w:p>
-    <w:bookmarkEnd w:id="20"/>
-    <w:bookmarkStart w:id="21" w:name="messaging-rules"/>
+    <w:bookmarkEnd w:id="22"/>
+    <w:bookmarkStart w:id="23" w:name="messaging-rules"/>
     <w:p>
       <w:pPr>
         <w:pStyle w:val="Heading2"/>
@@ -1129,8 +1468,8 @@
         <w:t xml:space="preserve">A person approves every message, or a batch under a standing approval with a daily send limit. Texts go only to partners with SMS consent, from a registered number, in daytime hours, with opt-out language, and every STOP is honored permanently. No message promises approval, rates or income. 7FF approves offer copy and anything about program terms, and only 7FF sets commissions and payouts.</w:t>
       </w:r>
     </w:p>
-    <w:bookmarkEnd w:id="21"/>
-    <w:bookmarkStart w:id="22" w:name="confidentiality-and-partner-data"/>
+    <w:bookmarkEnd w:id="23"/>
+    <w:bookmarkStart w:id="24" w:name="confidentiality-and-partner-data"/>
     <w:p>
       <w:pPr>
         <w:pStyle w:val="Heading2"/>
@@ -1152,7 +1491,7 @@
         <w:pStyle w:val="Compact"/>
         <w:numPr>
           <w:ilvl w:val="0"/>
-          <w:numId w:val="1004"/>
+          <w:numId w:val="1007"/>
         </w:numPr>
       </w:pPr>
       <w:r>
@@ -1164,7 +1503,7 @@
         <w:pStyle w:val="Compact"/>
         <w:numPr>
           <w:ilvl w:val="0"/>
-          <w:numId w:val="1004"/>
+          <w:numId w:val="1007"/>
         </w:numPr>
       </w:pPr>
       <w:r>
@@ -1176,7 +1515,7 @@
         <w:pStyle w:val="Compact"/>
         <w:numPr>
           <w:ilvl w:val="0"/>
-          <w:numId w:val="1004"/>
+          <w:numId w:val="1007"/>
         </w:numPr>
       </w:pPr>
       <w:r>
@@ -1188,15 +1527,15 @@
         <w:pStyle w:val="Compact"/>
         <w:numPr>
           <w:ilvl w:val="0"/>
-          <w:numId w:val="1004"/>
+          <w:numId w:val="1007"/>
         </w:numPr>
       </w:pPr>
       <w:r>
         <w:t xml:space="preserve">return or delete partner data within 30 days after this Agreement ends.</w:t>
       </w:r>
     </w:p>
-    <w:bookmarkEnd w:id="22"/>
-    <w:bookmarkStart w:id="23" w:name="ownership"/>
+    <w:bookmarkEnd w:id="24"/>
+    <w:bookmarkStart w:id="25" w:name="ownership"/>
     <w:p>
       <w:pPr>
         <w:pStyle w:val="Heading2"/>
@@ -1210,17 +1549,17 @@
         <w:pStyle w:val="FirstParagraph"/>
       </w:pPr>
       <w:r>
-        <w:t xml:space="preserve">Partner data and 7FF’s content belong to 7FF. The workflows, fields, tags, pipelines and templates built in 7FF’s GoHighLevel belong to 7FF and stay with it. Provider keeps its agent software, code, prompts and methods, including improvements made while delivering the Program.</w:t>
-      </w:r>
-    </w:p>
-    <w:bookmarkEnd w:id="23"/>
-    <w:bookmarkStart w:id="24" w:name="case-study"/>
+        <w:t xml:space="preserve">Partner data, partner profiles and 7FF’s content belong to 7FF. The workflows, fields, tags, pipelines and templates built in 7FF’s GoHighLevel belong to 7FF and stay with it. Provider keeps its agent software, code, prompts and methods, including improvements made while delivering the Program.</w:t>
+      </w:r>
+    </w:p>
+    <w:bookmarkEnd w:id="25"/>
+    <w:bookmarkStart w:id="26" w:name="community-release-and-coaching"/>
     <w:p>
       <w:pPr>
         <w:pStyle w:val="Heading2"/>
       </w:pPr>
       <w:r>
-        <w:t xml:space="preserve">10. Case study</w:t>
+        <w:t xml:space="preserve">10. Community release and coaching</w:t>
       </w:r>
     </w:p>
     <w:p>
@@ -1228,17 +1567,35 @@
         <w:pStyle w:val="FirstParagraph"/>
       </w:pPr>
       <w:r>
+        <w:t xml:space="preserve">By separate written agreement, the parties may extend the Program to the wider community, including affiliate coaching for group members and a controlled release of the system to the community.</w:t>
+      </w:r>
+    </w:p>
+    <w:bookmarkEnd w:id="26"/>
+    <w:bookmarkStart w:id="27" w:name="case-study"/>
+    <w:p>
+      <w:pPr>
+        <w:pStyle w:val="Heading2"/>
+      </w:pPr>
+      <w:r>
+        <w:t xml:space="preserve">11. Case study</w:t>
+      </w:r>
+    </w:p>
+    <w:p>
+      <w:pPr>
+        <w:pStyle w:val="FirstParagraph"/>
+      </w:pPr>
+      <w:r>
         <w:t xml:space="preserve">With 7FF’s written approval of the content, Provider may present the Program’s results as a case study, including at Funding Machine Live and to other prospective clients.</w:t>
       </w:r>
     </w:p>
-    <w:bookmarkEnd w:id="24"/>
-    <w:bookmarkStart w:id="25" w:name="no-guarantee-of-results"/>
+    <w:bookmarkEnd w:id="27"/>
+    <w:bookmarkStart w:id="28" w:name="no-guarantee-of-results"/>
     <w:p>
       <w:pPr>
         <w:pStyle w:val="Heading2"/>
       </w:pPr>
       <w:r>
-        <w:t xml:space="preserve">11. No guarantee of results</w:t>
+        <w:t xml:space="preserve">12. No guarantee of results</w:t>
       </w:r>
     </w:p>
     <w:p>
@@ -1249,14 +1606,14 @@
         <w:t xml:space="preserve">Provider will deliver the Services with care, but does not guarantee any number of replies, re-engaged partners or deals. Cost figures in Part 1 are projections from published rates, not fixed prices.</w:t>
       </w:r>
     </w:p>
-    <w:bookmarkEnd w:id="25"/>
-    <w:bookmarkStart w:id="26" w:name="term-and-ending-the-agreement"/>
+    <w:bookmarkEnd w:id="28"/>
+    <w:bookmarkStart w:id="29" w:name="term-and-ending-the-agreement"/>
     <w:p>
       <w:pPr>
         <w:pStyle w:val="Heading2"/>
       </w:pPr>
       <w:r>
-        <w:t xml:space="preserve">12. Term and ending the Agreement</w:t>
+        <w:t xml:space="preserve">13. Term and ending the Agreement</w:t>
       </w:r>
     </w:p>
     <w:p>
@@ -1264,17 +1621,25 @@
         <w:pStyle w:val="FirstParagraph"/>
       </w:pPr>
       <w:r>
-        <w:t xml:space="preserve">This Agreement starts on the Effective Date and continues month to month. Either party may end it with 30 days’ written notice, or immediately if the other party materially breaches it and does not fix the breach within 15 days of written notice. When it ends, Provider stops all outreach and handles partner data under section 8. Performance shares on deals submitted by Re-engaged Partners before the end date remain payable, as do usage costs incurred before the end date.</w:t>
-      </w:r>
-    </w:p>
-    <w:bookmarkEnd w:id="26"/>
-    <w:bookmarkStart w:id="27" w:name="liability"/>
+        <w:t xml:space="preserve">The first 90 days after the Effective Date are the Kickstart. During the Kickstart, either party may end this Agreement only if the other materially breaches it and does not fix the breach within 15 days of written notice. At the end of the Kickstart the parties review the results together. The Agreement then continues month to month, and either party may end it with 30 days’ written notice. The parties intend to run the Program for 6 to 12 months.</w:t>
+      </w:r>
+    </w:p>
+    <w:p>
+      <w:pPr>
+        <w:pStyle w:val="BodyText"/>
+      </w:pPr>
+      <w:r>
+        <w:t xml:space="preserve">When the Agreement ends, Provider stops all outreach and handles partner data under section 8. Performance shares on deals submitted by Re-engaged Partners before the end date remain payable, as do usage costs incurred before the end date.</w:t>
+      </w:r>
+    </w:p>
+    <w:bookmarkEnd w:id="29"/>
+    <w:bookmarkStart w:id="30" w:name="liability"/>
     <w:p>
       <w:pPr>
         <w:pStyle w:val="Heading2"/>
       </w:pPr>
       <w:r>
-        <w:t xml:space="preserve">13. Liability</w:t>
+        <w:t xml:space="preserve">14. Liability</w:t>
       </w:r>
     </w:p>
     <w:p>
@@ -1285,14 +1650,14 @@
         <w:t xml:space="preserve">Neither party is liable to the other for indirect, incidental or consequential damages, or for lost profits. Except for breaches of section 8, each party’s total liability under this Agreement is limited to the amounts paid or payable to Provider under it in the 12 months before the claim.</w:t>
       </w:r>
     </w:p>
-    <w:bookmarkEnd w:id="27"/>
-    <w:bookmarkStart w:id="28" w:name="general"/>
+    <w:bookmarkEnd w:id="30"/>
+    <w:bookmarkStart w:id="31" w:name="general"/>
     <w:p>
       <w:pPr>
         <w:pStyle w:val="Heading2"/>
       </w:pPr>
       <w:r>
-        <w:t xml:space="preserve">14. General</w:t>
+        <w:t xml:space="preserve">15. General</w:t>
       </w:r>
     </w:p>
     <w:p>
@@ -1300,11 +1665,11 @@
         <w:pStyle w:val="FirstParagraph"/>
       </w:pPr>
       <w:r>
-        <w:t xml:space="preserve">The parties are independent contractors. Neither is the other’s employee, partner or agent, and neither can bind the other. This Agreement, together with 7FF’s NDA, is the parties’ entire agreement on this subject, and changes must be in writing and signed by both. It is governed by the laws of [state]. It may be signed electronically and in counterparts.</w:t>
-      </w:r>
-    </w:p>
-    <w:bookmarkEnd w:id="28"/>
-    <w:bookmarkStart w:id="29" w:name="signatures"/>
+        <w:t xml:space="preserve">The parties are independent contractors. Neither is the other’s employee, partner or agent, and neither can bind the other. This Agreement, together with 7FF’s NDA, is the parties’ entire agreement on this subject, and changes must be in writing and signed by both. It is governed by the laws of the state named in the Key terms. It may be signed electronically and in counterparts.</w:t>
+      </w:r>
+    </w:p>
+    <w:bookmarkEnd w:id="31"/>
+    <w:bookmarkStart w:id="32" w:name="signatures"/>
     <w:p>
       <w:pPr>
         <w:pStyle w:val="Heading2"/>
@@ -1366,18 +1731,18 @@
               <w:pStyle w:val="Compact"/>
             </w:pPr>
             <w:r>
-              <w:t xml:space="preserve">Entity:</w:t>
-            </w:r>
-          </w:p>
-        </w:tc>
-        <w:tc>
-          <w:tcPr/>
-          <w:p>
-            <w:pPr>
-              <w:pStyle w:val="Compact"/>
-            </w:pPr>
-            <w:r>
-              <w:t xml:space="preserve">Entity:</w:t>
+              <w:t xml:space="preserve">Name:</w:t>
+            </w:r>
+          </w:p>
+        </w:tc>
+        <w:tc>
+          <w:tcPr/>
+          <w:p>
+            <w:pPr>
+              <w:pStyle w:val="Compact"/>
+            </w:pPr>
+            <w:r>
+              <w:t xml:space="preserve">Name: Justin Bellware</w:t>
             </w:r>
           </w:p>
         </w:tc>
@@ -1390,18 +1755,18 @@
               <w:pStyle w:val="Compact"/>
             </w:pPr>
             <w:r>
-              <w:t xml:space="preserve">Name:</w:t>
-            </w:r>
-          </w:p>
-        </w:tc>
-        <w:tc>
-          <w:tcPr/>
-          <w:p>
-            <w:pPr>
-              <w:pStyle w:val="Compact"/>
-            </w:pPr>
-            <w:r>
-              <w:t xml:space="preserve">Name: Justin Bellware</w:t>
+              <w:t xml:space="preserve">Title:</w:t>
+            </w:r>
+          </w:p>
+        </w:tc>
+        <w:tc>
+          <w:tcPr/>
+          <w:p>
+            <w:pPr>
+              <w:pStyle w:val="Compact"/>
+            </w:pPr>
+            <w:r>
+              <w:t xml:space="preserve">Title:</w:t>
             </w:r>
           </w:p>
         </w:tc>
@@ -1414,18 +1779,18 @@
               <w:pStyle w:val="Compact"/>
             </w:pPr>
             <w:r>
-              <w:t xml:space="preserve">Title:</w:t>
-            </w:r>
-          </w:p>
-        </w:tc>
-        <w:tc>
-          <w:tcPr/>
-          <w:p>
-            <w:pPr>
-              <w:pStyle w:val="Compact"/>
-            </w:pPr>
-            <w:r>
-              <w:t xml:space="preserve">Title:</w:t>
+              <w:t xml:space="preserve">Signature:</w:t>
+            </w:r>
+          </w:p>
+        </w:tc>
+        <w:tc>
+          <w:tcPr/>
+          <w:p>
+            <w:pPr>
+              <w:pStyle w:val="Compact"/>
+            </w:pPr>
+            <w:r>
+              <w:t xml:space="preserve">Signature:</w:t>
             </w:r>
           </w:p>
         </w:tc>
@@ -1438,30 +1803,6 @@
               <w:pStyle w:val="Compact"/>
             </w:pPr>
             <w:r>
-              <w:t xml:space="preserve">Signature:</w:t>
-            </w:r>
-          </w:p>
-        </w:tc>
-        <w:tc>
-          <w:tcPr/>
-          <w:p>
-            <w:pPr>
-              <w:pStyle w:val="Compact"/>
-            </w:pPr>
-            <w:r>
-              <w:t xml:space="preserve">Signature:</w:t>
-            </w:r>
-          </w:p>
-        </w:tc>
-      </w:tr>
-      <w:tr>
-        <w:tc>
-          <w:tcPr/>
-          <w:p>
-            <w:pPr>
-              <w:pStyle w:val="Compact"/>
-            </w:pPr>
-            <w:r>
               <w:t xml:space="preserve">Date:</w:t>
             </w:r>
           </w:p>
@@ -1479,8 +1820,8 @@
         </w:tc>
       </w:tr>
     </w:tbl>
-    <w:bookmarkEnd w:id="29"/>
-    <w:bookmarkEnd w:id="30"/>
+    <w:bookmarkEnd w:id="32"/>
+    <w:bookmarkEnd w:id="33"/>
     <w:sectPr>
       <w:footnotePr>
         <w:numRestart w:val="eachSect"/>
@@ -1591,6 +1932,91 @@
       </w:pPr>
     </w:lvl>
   </w:abstractNum>
+  <w:abstractNum w:abstractNumId="99411">
+    <w:nsid w:val="00A99411"/>
+    <w:multiLevelType w:val="multilevel"/>
+    <w:lvl w:ilvl="0">
+      <w:start w:val="1"/>
+      <w:numFmt w:val="decimal"/>
+      <w:lvlText w:val="%1."/>
+      <w:lvlJc w:val="left"/>
+      <w:pPr>
+        <w:ind w:left="720" w:hanging="360"/>
+      </w:pPr>
+    </w:lvl>
+    <w:lvl w:ilvl="1">
+      <w:start w:val="1"/>
+      <w:numFmt w:val="decimal"/>
+      <w:lvlText w:val="%2."/>
+      <w:lvlJc w:val="left"/>
+      <w:pPr>
+        <w:ind w:left="1440" w:hanging="360"/>
+      </w:pPr>
+    </w:lvl>
+    <w:lvl w:ilvl="2">
+      <w:start w:val="1"/>
+      <w:numFmt w:val="decimal"/>
+      <w:lvlText w:val="%3."/>
+      <w:lvlJc w:val="left"/>
+      <w:pPr>
+        <w:ind w:left="2160" w:hanging="360"/>
+      </w:pPr>
+    </w:lvl>
+    <w:lvl w:ilvl="3">
+      <w:start w:val="1"/>
+      <w:numFmt w:val="decimal"/>
+      <w:lvlText w:val="%4."/>
+      <w:lvlJc w:val="left"/>
+      <w:pPr>
+        <w:ind w:left="2880" w:hanging="360"/>
+      </w:pPr>
+    </w:lvl>
+    <w:lvl w:ilvl="4">
+      <w:start w:val="1"/>
+      <w:numFmt w:val="decimal"/>
+      <w:lvlText w:val="%5."/>
+      <w:lvlJc w:val="left"/>
+      <w:pPr>
+        <w:ind w:left="3600" w:hanging="360"/>
+      </w:pPr>
+    </w:lvl>
+    <w:lvl w:ilvl="5">
+      <w:start w:val="1"/>
+      <w:numFmt w:val="decimal"/>
+      <w:lvlText w:val="%6."/>
+      <w:lvlJc w:val="left"/>
+      <w:pPr>
+        <w:ind w:left="4320" w:hanging="360"/>
+      </w:pPr>
+    </w:lvl>
+    <w:lvl w:ilvl="6">
+      <w:start w:val="1"/>
+      <w:numFmt w:val="decimal"/>
+      <w:lvlText w:val="%7."/>
+      <w:lvlJc w:val="left"/>
+      <w:pPr>
+        <w:ind w:left="5040" w:hanging="360"/>
+      </w:pPr>
+    </w:lvl>
+    <w:lvl w:ilvl="7">
+      <w:start w:val="1"/>
+      <w:numFmt w:val="decimal"/>
+      <w:lvlText w:val="%8."/>
+      <w:lvlJc w:val="left"/>
+      <w:pPr>
+        <w:ind w:left="5760" w:hanging="360"/>
+      </w:pPr>
+    </w:lvl>
+    <w:lvl w:ilvl="8">
+      <w:start w:val="1"/>
+      <w:numFmt w:val="decimal"/>
+      <w:lvlText w:val="%9."/>
+      <w:lvlJc w:val="left"/>
+      <w:pPr>
+        <w:ind w:left="6480" w:hanging="360"/>
+      </w:pPr>
+    </w:lvl>
+  </w:abstractNum>
   <w:abstractNum w:abstractNumId="991">
     <w:nsid w:val="0000A991"/>
     <w:multiLevelType w:val="multilevel"/>
@@ -1698,7 +2124,34 @@
     <w:abstractNumId w:val="990"/>
   </w:num>
   <w:num w:numId="1001">
-    <w:abstractNumId w:val="991"/>
+    <w:abstractNumId w:val="99411"/>
+    <w:lvlOverride w:ilvl="0">
+      <w:startOverride w:val="1"/>
+    </w:lvlOverride>
+    <w:lvlOverride w:ilvl="1">
+      <w:startOverride w:val="1"/>
+    </w:lvlOverride>
+    <w:lvlOverride w:ilvl="2">
+      <w:startOverride w:val="1"/>
+    </w:lvlOverride>
+    <w:lvlOverride w:ilvl="3">
+      <w:startOverride w:val="1"/>
+    </w:lvlOverride>
+    <w:lvlOverride w:ilvl="4">
+      <w:startOverride w:val="1"/>
+    </w:lvlOverride>
+    <w:lvlOverride w:ilvl="5">
+      <w:startOverride w:val="1"/>
+    </w:lvlOverride>
+    <w:lvlOverride w:ilvl="6">
+      <w:startOverride w:val="1"/>
+    </w:lvlOverride>
+    <w:lvlOverride w:ilvl="7">
+      <w:startOverride w:val="1"/>
+    </w:lvlOverride>
+    <w:lvlOverride w:ilvl="8">
+      <w:startOverride w:val="1"/>
+    </w:lvlOverride>
   </w:num>
   <w:num w:numId="1002">
     <w:abstractNumId w:val="991"/>
@@ -1707,6 +2160,15 @@
     <w:abstractNumId w:val="991"/>
   </w:num>
   <w:num w:numId="1004">
+    <w:abstractNumId w:val="991"/>
+  </w:num>
+  <w:num w:numId="1005">
+    <w:abstractNumId w:val="991"/>
+  </w:num>
+  <w:num w:numId="1006">
+    <w:abstractNumId w:val="991"/>
+  </w:num>
+  <w:num w:numId="1007">
     <w:abstractNumId w:val="991"/>
   </w:num>
 </w:numbering>

</xml_diff>

<commit_message>
Agreement: 2x and 5x projected costs, Florida law, simpler rollout and messaging terms
- cost model computes the 2x and 5x planning figures; the build checks them
- removed goal 5, the pilot detail in phase 1, the Brock session and consent
  records from the needs list, and the deal-window and Funding Machine key terms

Co-Authored-By: Claude Opus 5.5 <noreply@anthropic.com>
</commit_message>
<xml_diff>
--- a/docs/proposal-and-agreement-7ff.docx
+++ b/docs/proposal-and-agreement-7ff.docx
@@ -65,7 +65,7 @@
         <w:t xml:space="preserve"> </w:t>
       </w:r>
       <w:r>
-        <w:t xml:space="preserve">September 23, 2026</w:t>
+        <w:t xml:space="preserve">September 24, 2026</w:t>
       </w:r>
     </w:p>
     <w:bookmarkStart w:id="15" w:name="part-1-proposal"/>
@@ -188,28 +188,6 @@
         <w:t xml:space="preserve">For every partner who engages, a plan for turning them into a steady source of deals.</w:t>
       </w:r>
     </w:p>
-    <w:p>
-      <w:pPr>
-        <w:pStyle w:val="Compact"/>
-        <w:numPr>
-          <w:ilvl w:val="0"/>
-          <w:numId w:val="1001"/>
-        </w:numPr>
-      </w:pPr>
-      <w:r>
-        <w:rPr>
-          <w:b/>
-          <w:bCs/>
-        </w:rPr>
-        <w:t xml:space="preserve">Coach the community.</w:t>
-      </w:r>
-      <w:r>
-        <w:t xml:space="preserve"> </w:t>
-      </w:r>
-      <w:r>
-        <w:t xml:space="preserve">In time, offer affiliate coaching in the group, helping members grow their own affiliate and referral programs.</w:t>
-      </w:r>
-    </w:p>
     <w:bookmarkEnd w:id="9"/>
     <w:bookmarkStart w:id="10" w:name="how-it-unfolds"/>
     <w:p>
@@ -239,7 +217,7 @@
         <w:t xml:space="preserve"> </w:t>
       </w:r>
       <w:r>
-        <w:t xml:space="preserve">One personal text to each quiet partner, written from their own record, then a real back-and-forth with everyone who answers. It starts with a pilot of 250 partners, then 2,500, then the remaining 10,200. Each wave opens only when the one before it has worked: low opt-outs, a healthy texting number, conversations 7FF is happy with, deals counted by tier, and AI spend on track.</w:t>
+        <w:t xml:space="preserve">One personal text to each quiet partner, written from their own record, then a real back-and-forth with everyone who answers.</w:t>
       </w:r>
     </w:p>
     <w:p>
@@ -579,14 +557,13 @@
         <w:pStyle w:val="FirstParagraph"/>
       </w:pPr>
       <w:r>
-        <w:t xml:space="preserve">The agent runs on GPT-6 Luna Pro through OpenRouter, with GLM 5.3 Flash (open weights) as the fallback, and Jev to read, check and classify. Priced on published OpenRouter, TypeSafe and HighLevel rates:</w:t>
+        <w:t xml:space="preserve">The agent runs on GPT-6 Luna Pro through OpenRouter, with GLM 5.3 Flash (open weights) as the fallback, and Jev to read, check and classify. Projected from published OpenRouter, TypeSafe and HighLevel rates, at two and five times the base estimate:</w:t>
       </w:r>
     </w:p>
     <w:tbl>
       <w:tblPr>
         <w:tblStyle w:val="Table"/>
-        <w:tblW w:type="pct" w:w="5000"/>
-        <w:tblLayout w:type="fixed"/>
+        <w:tblW w:type="auto" w:w="0"/>
         <w:tblLook w:firstRow="1" w:lastRow="0" w:firstColumn="0" w:lastColumn="0" w:noHBand="0" w:noVBand="0" w:val="0020"/>
       </w:tblPr>
       <w:tblGrid>
@@ -637,29 +614,29 @@
               <w:pStyle w:val="Compact"/>
             </w:pPr>
             <w:r>
-              <w:t xml:space="preserve">AI, projected</w:t>
-            </w:r>
-          </w:p>
-        </w:tc>
-        <w:tc>
-          <w:tcPr/>
-          <w:p>
-            <w:pPr>
-              <w:pStyle w:val="Compact"/>
-            </w:pPr>
-            <w:r>
-              <w:t xml:space="preserve">$10.05</w:t>
-            </w:r>
-          </w:p>
-        </w:tc>
-        <w:tc>
-          <w:tcPr/>
-          <w:p>
-            <w:pPr>
-              <w:pStyle w:val="Compact"/>
-            </w:pPr>
-            <w:r>
-              <w:t xml:space="preserve">$35.72</w:t>
+              <w:t xml:space="preserve">AI, projected at 2x</w:t>
+            </w:r>
+          </w:p>
+        </w:tc>
+        <w:tc>
+          <w:tcPr/>
+          <w:p>
+            <w:pPr>
+              <w:pStyle w:val="Compact"/>
+            </w:pPr>
+            <w:r>
+              <w:t xml:space="preserve">$20.10</w:t>
+            </w:r>
+          </w:p>
+        </w:tc>
+        <w:tc>
+          <w:tcPr/>
+          <w:p>
+            <w:pPr>
+              <w:pStyle w:val="Compact"/>
+            </w:pPr>
+            <w:r>
+              <w:t xml:space="preserve">$71.44</w:t>
             </w:r>
           </w:p>
         </w:tc>
@@ -672,41 +649,29 @@
               <w:pStyle w:val="Compact"/>
             </w:pPr>
             <w:r>
-              <w:rPr>
-                <w:b/>
-                <w:bCs/>
-              </w:rPr>
-              <w:t xml:space="preserve">AI, starting budget (2x the projection)</w:t>
-            </w:r>
-          </w:p>
-        </w:tc>
-        <w:tc>
-          <w:tcPr/>
-          <w:p>
-            <w:pPr>
-              <w:pStyle w:val="Compact"/>
-            </w:pPr>
-            <w:r>
-              <w:rPr>
-                <w:b/>
-                <w:bCs/>
-              </w:rPr>
-              <w:t xml:space="preserve">$20.10</w:t>
-            </w:r>
-          </w:p>
-        </w:tc>
-        <w:tc>
-          <w:tcPr/>
-          <w:p>
-            <w:pPr>
-              <w:pStyle w:val="Compact"/>
-            </w:pPr>
-            <w:r>
-              <w:rPr>
-                <w:b/>
-                <w:bCs/>
-              </w:rPr>
-              <w:t xml:space="preserve">$71.44</w:t>
+              <w:t xml:space="preserve">AI, projected at 5x</w:t>
+            </w:r>
+          </w:p>
+        </w:tc>
+        <w:tc>
+          <w:tcPr/>
+          <w:p>
+            <w:pPr>
+              <w:pStyle w:val="Compact"/>
+            </w:pPr>
+            <w:r>
+              <w:t xml:space="preserve">$50.25</w:t>
+            </w:r>
+          </w:p>
+        </w:tc>
+        <w:tc>
+          <w:tcPr/>
+          <w:p>
+            <w:pPr>
+              <w:pStyle w:val="Compact"/>
+            </w:pPr>
+            <w:r>
+              <w:t xml:space="preserve">$178.60</w:t>
             </w:r>
           </w:p>
         </w:tc>
@@ -719,29 +684,64 @@
               <w:pStyle w:val="Compact"/>
             </w:pPr>
             <w:r>
-              <w:t xml:space="preserve">Texting through HighLevel, projected</w:t>
-            </w:r>
-          </w:p>
-        </w:tc>
-        <w:tc>
-          <w:tcPr/>
-          <w:p>
-            <w:pPr>
-              <w:pStyle w:val="Compact"/>
-            </w:pPr>
-            <w:r>
-              <w:t xml:space="preserve">$355.24</w:t>
-            </w:r>
-          </w:p>
-        </w:tc>
-        <w:tc>
-          <w:tcPr/>
-          <w:p>
-            <w:pPr>
-              <w:pStyle w:val="Compact"/>
-            </w:pPr>
-            <w:r>
-              <w:t xml:space="preserve">$417.84</w:t>
+              <w:t xml:space="preserve">Texting through HighLevel, projected at 2x</w:t>
+            </w:r>
+          </w:p>
+        </w:tc>
+        <w:tc>
+          <w:tcPr/>
+          <w:p>
+            <w:pPr>
+              <w:pStyle w:val="Compact"/>
+            </w:pPr>
+            <w:r>
+              <w:t xml:space="preserve">$710.48</w:t>
+            </w:r>
+          </w:p>
+        </w:tc>
+        <w:tc>
+          <w:tcPr/>
+          <w:p>
+            <w:pPr>
+              <w:pStyle w:val="Compact"/>
+            </w:pPr>
+            <w:r>
+              <w:t xml:space="preserve">$835.68</w:t>
+            </w:r>
+          </w:p>
+        </w:tc>
+      </w:tr>
+      <w:tr>
+        <w:tc>
+          <w:tcPr/>
+          <w:p>
+            <w:pPr>
+              <w:pStyle w:val="Compact"/>
+            </w:pPr>
+            <w:r>
+              <w:t xml:space="preserve">Texting through HighLevel, projected at 5x</w:t>
+            </w:r>
+          </w:p>
+        </w:tc>
+        <w:tc>
+          <w:tcPr/>
+          <w:p>
+            <w:pPr>
+              <w:pStyle w:val="Compact"/>
+            </w:pPr>
+            <w:r>
+              <w:t xml:space="preserve">$1,776.20</w:t>
+            </w:r>
+          </w:p>
+        </w:tc>
+        <w:tc>
+          <w:tcPr/>
+          <w:p>
+            <w:pPr>
+              <w:pStyle w:val="Compact"/>
+            </w:pPr>
+            <w:r>
+              <w:t xml:space="preserve">$2,089.20</w:t>
             </w:r>
           </w:p>
         </w:tc>
@@ -798,7 +798,7 @@
         </w:numPr>
       </w:pPr>
       <w:r>
-        <w:t xml:space="preserve">A technical session with Brock on the integration</w:t>
+        <w:t xml:space="preserve">A GoHighLevel sub-account with API access, and an A2P 10DLC-registered texting number</w:t>
       </w:r>
     </w:p>
     <w:p>
@@ -810,7 +810,7 @@
         </w:numPr>
       </w:pPr>
       <w:r>
-        <w:t xml:space="preserve">A GoHighLevel sub-account with API access, and an A2P 10DLC-registered texting number</w:t>
+        <w:t xml:space="preserve">A named partner lead who approves offers and program copy</w:t>
       </w:r>
     </w:p>
     <w:p>
@@ -822,30 +822,6 @@
         </w:numPr>
       </w:pPr>
       <w:r>
-        <w:t xml:space="preserve">SMS consent records for the partners in scope</w:t>
-      </w:r>
-    </w:p>
-    <w:p>
-      <w:pPr>
-        <w:pStyle w:val="Compact"/>
-        <w:numPr>
-          <w:ilvl w:val="0"/>
-          <w:numId w:val="1004"/>
-        </w:numPr>
-      </w:pPr>
-      <w:r>
-        <w:t xml:space="preserve">A named partner lead who approves offers and program copy</w:t>
-      </w:r>
-    </w:p>
-    <w:p>
-      <w:pPr>
-        <w:pStyle w:val="Compact"/>
-        <w:numPr>
-          <w:ilvl w:val="0"/>
-          <w:numId w:val="1004"/>
-        </w:numPr>
-      </w:pPr>
-      <w:r>
         <w:t xml:space="preserve">The deal records used to calculate our share</w:t>
       </w:r>
     </w:p>
@@ -884,394 +860,6 @@
       </w:pPr>
       <w:r>
         <w:t xml:space="preserve">Key terms</w:t>
-      </w:r>
-    </w:p>
-    <w:tbl>
-      <w:tblPr>
-        <w:tblStyle w:val="Table"/>
-        <w:tblW w:type="pct" w:w="5000"/>
-        <w:tblLayout w:type="fixed"/>
-        <w:tblLook w:firstRow="1" w:lastRow="0" w:firstColumn="0" w:lastColumn="0" w:noHBand="0" w:noVBand="0" w:val="0020"/>
-      </w:tblPr>
-      <w:tblGrid>
-        <w:gridCol w:w="3960"/>
-        <w:gridCol w:w="3960"/>
-      </w:tblGrid>
-      <w:tr>
-        <w:trPr>
-          <w:tblHeader w:val="on"/>
-        </w:trPr>
-        <w:tc>
-          <w:tcPr/>
-          <w:p>
-            <w:pPr>
-              <w:pStyle w:val="Compact"/>
-            </w:pPr>
-            <w:r>
-              <w:t xml:space="preserve">Term</w:t>
-            </w:r>
-          </w:p>
-        </w:tc>
-        <w:tc>
-          <w:tcPr/>
-          <w:p>
-            <w:pPr>
-              <w:pStyle w:val="Compact"/>
-            </w:pPr>
-            <w:r>
-              <w:t xml:space="preserve">Entry</w:t>
-            </w:r>
-          </w:p>
-        </w:tc>
-      </w:tr>
-      <w:tr>
-        <w:tc>
-          <w:tcPr/>
-          <w:p>
-            <w:pPr>
-              <w:pStyle w:val="Compact"/>
-            </w:pPr>
-            <w:r>
-              <w:t xml:space="preserve">7FF legal entity (name, state, entity type)</w:t>
-            </w:r>
-          </w:p>
-        </w:tc>
-        <w:tc>
-          <w:tcPr/>
-          <w:p>
-            <w:pPr>
-              <w:pStyle w:val="Compact"/>
-            </w:pPr>
-          </w:p>
-        </w:tc>
-      </w:tr>
-      <w:tr>
-        <w:tc>
-          <w:tcPr/>
-          <w:p>
-            <w:pPr>
-              <w:pStyle w:val="Compact"/>
-            </w:pPr>
-            <w:r>
-              <w:t xml:space="preserve">Provider legal entity (name, state, entity type)</w:t>
-            </w:r>
-          </w:p>
-        </w:tc>
-        <w:tc>
-          <w:tcPr/>
-          <w:p>
-            <w:pPr>
-              <w:pStyle w:val="Compact"/>
-            </w:pPr>
-          </w:p>
-        </w:tc>
-      </w:tr>
-      <w:tr>
-        <w:tc>
-          <w:tcPr/>
-          <w:p>
-            <w:pPr>
-              <w:pStyle w:val="Compact"/>
-            </w:pPr>
-            <w:r>
-              <w:t xml:space="preserve">The performance share is calculated on</w:t>
-            </w:r>
-          </w:p>
-        </w:tc>
-        <w:tc>
-          <w:tcPr/>
-          <w:p>
-            <w:pPr>
-              <w:pStyle w:val="Compact"/>
-            </w:pPr>
-          </w:p>
-        </w:tc>
-      </w:tr>
-      <w:tr>
-        <w:tc>
-          <w:tcPr/>
-          <w:p>
-            <w:pPr>
-              <w:pStyle w:val="Compact"/>
-            </w:pPr>
-            <w:r>
-              <w:t xml:space="preserve">Months a Re-engaged Partner’s deals count after their first reply</w:t>
-            </w:r>
-          </w:p>
-        </w:tc>
-        <w:tc>
-          <w:tcPr/>
-          <w:p>
-            <w:pPr>
-              <w:pStyle w:val="Compact"/>
-            </w:pPr>
-          </w:p>
-        </w:tc>
-      </w:tr>
-      <w:tr>
-        <w:tc>
-          <w:tcPr/>
-          <w:p>
-            <w:pPr>
-              <w:pStyle w:val="Compact"/>
-            </w:pPr>
-            <w:r>
-              <w:t xml:space="preserve">Funding Machine purchases by Re-engaged Partners count at (%, or 0)</w:t>
-            </w:r>
-          </w:p>
-        </w:tc>
-        <w:tc>
-          <w:tcPr/>
-          <w:p>
-            <w:pPr>
-              <w:pStyle w:val="Compact"/>
-            </w:pPr>
-          </w:p>
-        </w:tc>
-      </w:tr>
-      <w:tr>
-        <w:tc>
-          <w:tcPr/>
-          <w:p>
-            <w:pPr>
-              <w:pStyle w:val="Compact"/>
-            </w:pPr>
-            <w:r>
-              <w:t xml:space="preserve">Governing law (state)</w:t>
-            </w:r>
-          </w:p>
-        </w:tc>
-        <w:tc>
-          <w:tcPr/>
-          <w:p>
-            <w:pPr>
-              <w:pStyle w:val="Compact"/>
-            </w:pPr>
-          </w:p>
-        </w:tc>
-      </w:tr>
-    </w:tbl>
-    <w:bookmarkEnd w:id="16"/>
-    <w:bookmarkStart w:id="17" w:name="services"/>
-    <w:p>
-      <w:pPr>
-        <w:pStyle w:val="Heading2"/>
-      </w:pPr>
-      <w:r>
-        <w:t xml:space="preserve">1. Services</w:t>
-      </w:r>
-    </w:p>
-    <w:p>
-      <w:pPr>
-        <w:pStyle w:val="FirstParagraph"/>
-      </w:pPr>
-      <w:r>
-        <w:t xml:space="preserve">Provider will act as the affiliate manager for 7FF’s partner program each month (the</w:t>
-      </w:r>
-      <w:r>
-        <w:t xml:space="preserve"> </w:t>
-      </w:r>
-      <w:r>
-        <w:t xml:space="preserve">“Program”</w:t>
-      </w:r>
-      <w:r>
-        <w:t xml:space="preserve">), as described in Part 1. The Services include:</w:t>
-      </w:r>
-    </w:p>
-    <w:p>
-      <w:pPr>
-        <w:pStyle w:val="Compact"/>
-        <w:numPr>
-          <w:ilvl w:val="0"/>
-          <w:numId w:val="1005"/>
-        </w:numPr>
-      </w:pPr>
-      <w:r>
-        <w:t xml:space="preserve">Phase 1, the reactivation kickoff for 7FF’s inactive partners;</w:t>
-      </w:r>
-    </w:p>
-    <w:p>
-      <w:pPr>
-        <w:pStyle w:val="Compact"/>
-        <w:numPr>
-          <w:ilvl w:val="0"/>
-          <w:numId w:val="1005"/>
-        </w:numPr>
-      </w:pPr>
-      <w:r>
-        <w:t xml:space="preserve">a partner profile for each partner in 7FF’s GoHighLevel, kept current;</w:t>
-      </w:r>
-    </w:p>
-    <w:p>
-      <w:pPr>
-        <w:pStyle w:val="Compact"/>
-        <w:numPr>
-          <w:ilvl w:val="0"/>
-          <w:numId w:val="1005"/>
-        </w:numPr>
-      </w:pPr>
-      <w:r>
-        <w:t xml:space="preserve">an ongoing relationship cadence, reply handling and follow-ups, run by the AI Funding Affiliate Manager under human approval;</w:t>
-      </w:r>
-    </w:p>
-    <w:p>
-      <w:pPr>
-        <w:pStyle w:val="Compact"/>
-        <w:numPr>
-          <w:ilvl w:val="0"/>
-          <w:numId w:val="1005"/>
-        </w:numPr>
-      </w:pPr>
-      <w:r>
-        <w:t xml:space="preserve">a revenue plan for each partner who engages; and</w:t>
-      </w:r>
-    </w:p>
-    <w:p>
-      <w:pPr>
-        <w:pStyle w:val="Compact"/>
-        <w:numPr>
-          <w:ilvl w:val="0"/>
-          <w:numId w:val="1005"/>
-        </w:numPr>
-      </w:pPr>
-      <w:r>
-        <w:t xml:space="preserve">a weekly scorecard.</w:t>
-      </w:r>
-    </w:p>
-    <w:p>
-      <w:pPr>
-        <w:pStyle w:val="FirstParagraph"/>
-      </w:pPr>
-      <w:r>
-        <w:t xml:space="preserve">Provider may use its own staff, contractors and software to deliver the Services.</w:t>
-      </w:r>
-    </w:p>
-    <w:bookmarkEnd w:id="17"/>
-    <w:bookmarkStart w:id="18" w:name="rollout"/>
-    <w:p>
-      <w:pPr>
-        <w:pStyle w:val="Heading2"/>
-      </w:pPr>
-      <w:r>
-        <w:t xml:space="preserve">2. Rollout</w:t>
-      </w:r>
-    </w:p>
-    <w:p>
-      <w:pPr>
-        <w:pStyle w:val="FirstParagraph"/>
-      </w:pPr>
-      <w:r>
-        <w:t xml:space="preserve">The reactivation starts with a pilot of 250 partners and continues in waves. The parties will agree the pilot’s measures of success in writing (email is enough) before it begins, and a new wave starts only when the previous wave meets them.</w:t>
-      </w:r>
-    </w:p>
-    <w:bookmarkEnd w:id="18"/>
-    <w:bookmarkStart w:id="19" w:name="what-7ff-provides"/>
-    <w:p>
-      <w:pPr>
-        <w:pStyle w:val="Heading2"/>
-      </w:pPr>
-      <w:r>
-        <w:t xml:space="preserve">3. What 7FF provides</w:t>
-      </w:r>
-    </w:p>
-    <w:p>
-      <w:pPr>
-        <w:pStyle w:val="FirstParagraph"/>
-      </w:pPr>
-      <w:r>
-        <w:t xml:space="preserve">7FF will provide the items listed under</w:t>
-      </w:r>
-      <w:r>
-        <w:t xml:space="preserve"> </w:t>
-      </w:r>
-      <w:r>
-        <w:t xml:space="preserve">“What we need from 7FF”</w:t>
-      </w:r>
-      <w:r>
-        <w:t xml:space="preserve"> </w:t>
-      </w:r>
-      <w:r>
-        <w:t xml:space="preserve">in Part 1. 7FF confirms that the partners it puts in scope for texting have agreed to receive texts from 7FF, and will tell Provider about any partner who has not.</w:t>
-      </w:r>
-    </w:p>
-    <w:bookmarkEnd w:id="19"/>
-    <w:bookmarkStart w:id="20" w:name="usage-costs"/>
-    <w:p>
-      <w:pPr>
-        <w:pStyle w:val="Heading2"/>
-      </w:pPr>
-      <w:r>
-        <w:t xml:space="preserve">4. Usage costs</w:t>
-      </w:r>
-    </w:p>
-    <w:p>
-      <w:pPr>
-        <w:pStyle w:val="FirstParagraph"/>
-      </w:pPr>
-      <w:r>
-        <w:t xml:space="preserve">7FF pays the usage costs of running the Program at cost, with no markup:</w:t>
-      </w:r>
-    </w:p>
-    <w:p>
-      <w:pPr>
-        <w:pStyle w:val="Compact"/>
-        <w:numPr>
-          <w:ilvl w:val="0"/>
-          <w:numId w:val="1006"/>
-        </w:numPr>
-      </w:pPr>
-      <w:r>
-        <w:rPr>
-          <w:b/>
-          <w:bCs/>
-        </w:rPr>
-        <w:t xml:space="preserve">AI usage.</w:t>
-      </w:r>
-      <w:r>
-        <w:t xml:space="preserve"> </w:t>
-      </w:r>
-      <w:r>
-        <w:t xml:space="preserve">Provider pays the model providers and bills 7FF monthly at cost, with a usage report.</w:t>
-      </w:r>
-    </w:p>
-    <w:p>
-      <w:pPr>
-        <w:pStyle w:val="Compact"/>
-        <w:numPr>
-          <w:ilvl w:val="0"/>
-          <w:numId w:val="1006"/>
-        </w:numPr>
-      </w:pPr>
-      <w:r>
-        <w:rPr>
-          <w:b/>
-          <w:bCs/>
-        </w:rPr>
-        <w:t xml:space="preserve">Texting.</w:t>
-      </w:r>
-      <w:r>
-        <w:t xml:space="preserve"> </w:t>
-      </w:r>
-      <w:r>
-        <w:t xml:space="preserve">HighLevel bills texting and A2P 10DLC registration fees to 7FF’s GoHighLevel sub-account directly.</w:t>
-      </w:r>
-    </w:p>
-    <w:bookmarkEnd w:id="20"/>
-    <w:bookmarkStart w:id="21" w:name="performance-share"/>
-    <w:p>
-      <w:pPr>
-        <w:pStyle w:val="Heading2"/>
-      </w:pPr>
-      <w:r>
-        <w:t xml:space="preserve">5. Performance share</w:t>
-      </w:r>
-    </w:p>
-    <w:p>
-      <w:pPr>
-        <w:pStyle w:val="FirstParagraph"/>
-      </w:pPr>
-      <w:r>
-        <w:t xml:space="preserve">For each deal submitted by a Re-engaged Partner, 7FF pays Provider the share below of the amount named in the Key terms, set by that partner’s tier on the date the deal is submitted:</w:t>
       </w:r>
     </w:p>
     <w:tbl>
@@ -1295,6 +883,354 @@
               <w:pStyle w:val="Compact"/>
             </w:pPr>
             <w:r>
+              <w:t xml:space="preserve">Term</w:t>
+            </w:r>
+          </w:p>
+        </w:tc>
+        <w:tc>
+          <w:tcPr/>
+          <w:p>
+            <w:pPr>
+              <w:pStyle w:val="Compact"/>
+            </w:pPr>
+            <w:r>
+              <w:t xml:space="preserve">Entry</w:t>
+            </w:r>
+          </w:p>
+        </w:tc>
+      </w:tr>
+      <w:tr>
+        <w:tc>
+          <w:tcPr/>
+          <w:p>
+            <w:pPr>
+              <w:pStyle w:val="Compact"/>
+            </w:pPr>
+            <w:r>
+              <w:t xml:space="preserve">7FF legal entity (name, state, entity type)</w:t>
+            </w:r>
+          </w:p>
+        </w:tc>
+        <w:tc>
+          <w:tcPr/>
+          <w:p>
+            <w:pPr>
+              <w:pStyle w:val="Compact"/>
+            </w:pPr>
+          </w:p>
+        </w:tc>
+      </w:tr>
+      <w:tr>
+        <w:tc>
+          <w:tcPr/>
+          <w:p>
+            <w:pPr>
+              <w:pStyle w:val="Compact"/>
+            </w:pPr>
+            <w:r>
+              <w:t xml:space="preserve">Provider legal entity (name, state, entity type)</w:t>
+            </w:r>
+          </w:p>
+        </w:tc>
+        <w:tc>
+          <w:tcPr/>
+          <w:p>
+            <w:pPr>
+              <w:pStyle w:val="Compact"/>
+            </w:pPr>
+          </w:p>
+        </w:tc>
+      </w:tr>
+      <w:tr>
+        <w:tc>
+          <w:tcPr/>
+          <w:p>
+            <w:pPr>
+              <w:pStyle w:val="Compact"/>
+            </w:pPr>
+            <w:r>
+              <w:t xml:space="preserve">The performance share is calculated on</w:t>
+            </w:r>
+          </w:p>
+        </w:tc>
+        <w:tc>
+          <w:tcPr/>
+          <w:p>
+            <w:pPr>
+              <w:pStyle w:val="Compact"/>
+            </w:pPr>
+          </w:p>
+        </w:tc>
+      </w:tr>
+      <w:tr>
+        <w:tc>
+          <w:tcPr/>
+          <w:p>
+            <w:pPr>
+              <w:pStyle w:val="Compact"/>
+            </w:pPr>
+            <w:r>
+              <w:t xml:space="preserve">Governing law (state)</w:t>
+            </w:r>
+          </w:p>
+        </w:tc>
+        <w:tc>
+          <w:tcPr/>
+          <w:p>
+            <w:pPr>
+              <w:pStyle w:val="Compact"/>
+            </w:pPr>
+            <w:r>
+              <w:t xml:space="preserve">Florida</w:t>
+            </w:r>
+          </w:p>
+        </w:tc>
+      </w:tr>
+    </w:tbl>
+    <w:bookmarkEnd w:id="16"/>
+    <w:bookmarkStart w:id="17" w:name="services"/>
+    <w:p>
+      <w:pPr>
+        <w:pStyle w:val="Heading2"/>
+      </w:pPr>
+      <w:r>
+        <w:t xml:space="preserve">1. Services</w:t>
+      </w:r>
+    </w:p>
+    <w:p>
+      <w:pPr>
+        <w:pStyle w:val="FirstParagraph"/>
+      </w:pPr>
+      <w:r>
+        <w:t xml:space="preserve">Provider will act as the affiliate manager for 7FF’s partner program each month (the</w:t>
+      </w:r>
+      <w:r>
+        <w:t xml:space="preserve"> </w:t>
+      </w:r>
+      <w:r>
+        <w:t xml:space="preserve">“Program”</w:t>
+      </w:r>
+      <w:r>
+        <w:t xml:space="preserve">), as described in Part 1. The Services include:</w:t>
+      </w:r>
+    </w:p>
+    <w:p>
+      <w:pPr>
+        <w:pStyle w:val="Compact"/>
+        <w:numPr>
+          <w:ilvl w:val="0"/>
+          <w:numId w:val="1005"/>
+        </w:numPr>
+      </w:pPr>
+      <w:r>
+        <w:t xml:space="preserve">Phase 1, the reactivation kickoff for 7FF’s inactive partners;</w:t>
+      </w:r>
+    </w:p>
+    <w:p>
+      <w:pPr>
+        <w:pStyle w:val="Compact"/>
+        <w:numPr>
+          <w:ilvl w:val="0"/>
+          <w:numId w:val="1005"/>
+        </w:numPr>
+      </w:pPr>
+      <w:r>
+        <w:t xml:space="preserve">a partner profile for each partner in 7FF’s GoHighLevel, kept current;</w:t>
+      </w:r>
+    </w:p>
+    <w:p>
+      <w:pPr>
+        <w:pStyle w:val="Compact"/>
+        <w:numPr>
+          <w:ilvl w:val="0"/>
+          <w:numId w:val="1005"/>
+        </w:numPr>
+      </w:pPr>
+      <w:r>
+        <w:t xml:space="preserve">an ongoing relationship cadence, reply handling and follow-ups, run by the AI Funding Affiliate Manager under human approval;</w:t>
+      </w:r>
+    </w:p>
+    <w:p>
+      <w:pPr>
+        <w:pStyle w:val="Compact"/>
+        <w:numPr>
+          <w:ilvl w:val="0"/>
+          <w:numId w:val="1005"/>
+        </w:numPr>
+      </w:pPr>
+      <w:r>
+        <w:t xml:space="preserve">a revenue plan for each partner who engages; and</w:t>
+      </w:r>
+    </w:p>
+    <w:p>
+      <w:pPr>
+        <w:pStyle w:val="Compact"/>
+        <w:numPr>
+          <w:ilvl w:val="0"/>
+          <w:numId w:val="1005"/>
+        </w:numPr>
+      </w:pPr>
+      <w:r>
+        <w:t xml:space="preserve">a weekly scorecard.</w:t>
+      </w:r>
+    </w:p>
+    <w:p>
+      <w:pPr>
+        <w:pStyle w:val="FirstParagraph"/>
+      </w:pPr>
+      <w:r>
+        <w:t xml:space="preserve">Provider may use its own staff, contractors and software to deliver the Services.</w:t>
+      </w:r>
+    </w:p>
+    <w:bookmarkEnd w:id="17"/>
+    <w:bookmarkStart w:id="18" w:name="rollout"/>
+    <w:p>
+      <w:pPr>
+        <w:pStyle w:val="Heading2"/>
+      </w:pPr>
+      <w:r>
+        <w:t xml:space="preserve">2. Rollout</w:t>
+      </w:r>
+    </w:p>
+    <w:p>
+      <w:pPr>
+        <w:pStyle w:val="FirstParagraph"/>
+      </w:pPr>
+      <w:r>
+        <w:t xml:space="preserve">The reactivation kicks off in batches and will continue in waves.</w:t>
+      </w:r>
+    </w:p>
+    <w:bookmarkEnd w:id="18"/>
+    <w:bookmarkStart w:id="19" w:name="what-7ff-provides"/>
+    <w:p>
+      <w:pPr>
+        <w:pStyle w:val="Heading2"/>
+      </w:pPr>
+      <w:r>
+        <w:t xml:space="preserve">3. What 7FF provides</w:t>
+      </w:r>
+    </w:p>
+    <w:p>
+      <w:pPr>
+        <w:pStyle w:val="FirstParagraph"/>
+      </w:pPr>
+      <w:r>
+        <w:t xml:space="preserve">7FF will provide the items listed under</w:t>
+      </w:r>
+      <w:r>
+        <w:t xml:space="preserve"> </w:t>
+      </w:r>
+      <w:r>
+        <w:t xml:space="preserve">“What we need from 7FF”</w:t>
+      </w:r>
+      <w:r>
+        <w:t xml:space="preserve"> </w:t>
+      </w:r>
+      <w:r>
+        <w:t xml:space="preserve">in Part 1. 7FF confirms that the partners it puts in scope for texting have agreed to receive texts from 7FF, and will tell Provider about any partner who has not.</w:t>
+      </w:r>
+    </w:p>
+    <w:bookmarkEnd w:id="19"/>
+    <w:bookmarkStart w:id="20" w:name="usage-costs"/>
+    <w:p>
+      <w:pPr>
+        <w:pStyle w:val="Heading2"/>
+      </w:pPr>
+      <w:r>
+        <w:t xml:space="preserve">4. Usage costs</w:t>
+      </w:r>
+    </w:p>
+    <w:p>
+      <w:pPr>
+        <w:pStyle w:val="FirstParagraph"/>
+      </w:pPr>
+      <w:r>
+        <w:t xml:space="preserve">7FF pays the usage costs of running the Program at cost, with no markup:</w:t>
+      </w:r>
+    </w:p>
+    <w:p>
+      <w:pPr>
+        <w:pStyle w:val="Compact"/>
+        <w:numPr>
+          <w:ilvl w:val="0"/>
+          <w:numId w:val="1006"/>
+        </w:numPr>
+      </w:pPr>
+      <w:r>
+        <w:rPr>
+          <w:b/>
+          <w:bCs/>
+        </w:rPr>
+        <w:t xml:space="preserve">AI usage.</w:t>
+      </w:r>
+      <w:r>
+        <w:t xml:space="preserve"> </w:t>
+      </w:r>
+      <w:r>
+        <w:t xml:space="preserve">Provider pays the model providers and bills 7FF monthly at cost, with a usage report.</w:t>
+      </w:r>
+    </w:p>
+    <w:p>
+      <w:pPr>
+        <w:pStyle w:val="Compact"/>
+        <w:numPr>
+          <w:ilvl w:val="0"/>
+          <w:numId w:val="1006"/>
+        </w:numPr>
+      </w:pPr>
+      <w:r>
+        <w:rPr>
+          <w:b/>
+          <w:bCs/>
+        </w:rPr>
+        <w:t xml:space="preserve">Texting.</w:t>
+      </w:r>
+      <w:r>
+        <w:t xml:space="preserve"> </w:t>
+      </w:r>
+      <w:r>
+        <w:t xml:space="preserve">HighLevel bills texting and A2P 10DLC registration fees to 7FF’s GoHighLevel sub-account directly.</w:t>
+      </w:r>
+    </w:p>
+    <w:bookmarkEnd w:id="20"/>
+    <w:bookmarkStart w:id="21" w:name="performance-share"/>
+    <w:p>
+      <w:pPr>
+        <w:pStyle w:val="Heading2"/>
+      </w:pPr>
+      <w:r>
+        <w:t xml:space="preserve">5. Performance share</w:t>
+      </w:r>
+    </w:p>
+    <w:p>
+      <w:pPr>
+        <w:pStyle w:val="FirstParagraph"/>
+      </w:pPr>
+      <w:r>
+        <w:t xml:space="preserve">For each deal submitted by a Re-engaged Partner, 7FF pays Provider the share below of the amount named in the Key terms, set by that partner’s tier on the date the deal is submitted:</w:t>
+      </w:r>
+    </w:p>
+    <w:tbl>
+      <w:tblPr>
+        <w:tblStyle w:val="Table"/>
+        <w:tblW w:type="auto" w:w="0"/>
+        <w:tblLook w:firstRow="1" w:lastRow="0" w:firstColumn="0" w:lastColumn="0" w:noHBand="0" w:noVBand="0" w:val="0020"/>
+      </w:tblPr>
+      <w:tblGrid>
+        <w:gridCol w:w="3960"/>
+        <w:gridCol w:w="3960"/>
+      </w:tblGrid>
+      <w:tr>
+        <w:trPr>
+          <w:tblHeader w:val="on"/>
+        </w:trPr>
+        <w:tc>
+          <w:tcPr/>
+          <w:p>
+            <w:pPr>
+              <w:pStyle w:val="Compact"/>
+            </w:pPr>
+            <w:r>
               <w:t xml:space="preserve">Partner tier</w:t>
             </w:r>
           </w:p>
@@ -1429,7 +1365,7 @@
         <w:t xml:space="preserve"> </w:t>
       </w:r>
       <w:r>
-        <w:t xml:space="preserve">is a partner who was inactive on the Effective Date and who replies to the Program’s outreach. A deal counts if it is submitted within the number of months in the Key terms after that partner’s first reply. A Re-engaged Partner’s purchase of the Funding Machine counts at the percentage in the Key terms.</w:t>
+        <w:t xml:space="preserve">is a partner who was inactive on the Effective Date and who replies to the Program’s outreach.</w:t>
       </w:r>
     </w:p>
     <w:bookmarkEnd w:id="21"/>
@@ -1465,7 +1401,7 @@
         <w:pStyle w:val="FirstParagraph"/>
       </w:pPr>
       <w:r>
-        <w:t xml:space="preserve">A person approves every message, or a batch under a standing approval with a daily send limit. Texts go only to partners with SMS consent, from a registered number, in daytime hours, with opt-out language, and every STOP is honored permanently. No message promises approval, rates or income. 7FF approves offer copy and anything about program terms, and only 7FF sets commissions and payouts.</w:t>
+        <w:t xml:space="preserve">A person on Provider’s team approves every message.</w:t>
       </w:r>
     </w:p>
     <w:bookmarkEnd w:id="23"/>

</xml_diff>

<commit_message>
Agreement: AI costs only (no texting figures); governing law left blank
Co-Authored-By: Claude Opus 5.5 <noreply@anthropic.com>
</commit_message>
<xml_diff>
--- a/docs/proposal-and-agreement-7ff.docx
+++ b/docs/proposal-and-agreement-7ff.docx
@@ -557,7 +557,7 @@
         <w:pStyle w:val="FirstParagraph"/>
       </w:pPr>
       <w:r>
-        <w:t xml:space="preserve">The agent runs on GPT-6 Luna Pro through OpenRouter, with GLM 5.3 Flash (open weights) as the fallback, and Jev to read, check and classify. Projected from published OpenRouter, TypeSafe and HighLevel rates, at two and five times the base estimate:</w:t>
+        <w:t xml:space="preserve">The agent runs on GPT-6 Luna Pro through OpenRouter, with GLM 5.3 Flash (open weights) as the fallback, and Jev to read, check and classify. Projected from published OpenRouter and TypeSafe rates, at two and five times the base estimate:</w:t>
       </w:r>
     </w:p>
     <w:tbl>
@@ -676,83 +676,13 @@
           </w:p>
         </w:tc>
       </w:tr>
-      <w:tr>
-        <w:tc>
-          <w:tcPr/>
-          <w:p>
-            <w:pPr>
-              <w:pStyle w:val="Compact"/>
-            </w:pPr>
-            <w:r>
-              <w:t xml:space="preserve">Texting through HighLevel, projected at 2x</w:t>
-            </w:r>
-          </w:p>
-        </w:tc>
-        <w:tc>
-          <w:tcPr/>
-          <w:p>
-            <w:pPr>
-              <w:pStyle w:val="Compact"/>
-            </w:pPr>
-            <w:r>
-              <w:t xml:space="preserve">$710.48</w:t>
-            </w:r>
-          </w:p>
-        </w:tc>
-        <w:tc>
-          <w:tcPr/>
-          <w:p>
-            <w:pPr>
-              <w:pStyle w:val="Compact"/>
-            </w:pPr>
-            <w:r>
-              <w:t xml:space="preserve">$835.68</w:t>
-            </w:r>
-          </w:p>
-        </w:tc>
-      </w:tr>
-      <w:tr>
-        <w:tc>
-          <w:tcPr/>
-          <w:p>
-            <w:pPr>
-              <w:pStyle w:val="Compact"/>
-            </w:pPr>
-            <w:r>
-              <w:t xml:space="preserve">Texting through HighLevel, projected at 5x</w:t>
-            </w:r>
-          </w:p>
-        </w:tc>
-        <w:tc>
-          <w:tcPr/>
-          <w:p>
-            <w:pPr>
-              <w:pStyle w:val="Compact"/>
-            </w:pPr>
-            <w:r>
-              <w:t xml:space="preserve">$1,776.20</w:t>
-            </w:r>
-          </w:p>
-        </w:tc>
-        <w:tc>
-          <w:tcPr/>
-          <w:p>
-            <w:pPr>
-              <w:pStyle w:val="Compact"/>
-            </w:pPr>
-            <w:r>
-              <w:t xml:space="preserve">$2,089.20</w:t>
-            </w:r>
-          </w:p>
-        </w:tc>
-      </w:tr>
     </w:tbl>
     <w:p>
       <w:pPr>
         <w:pStyle w:val="BodyText"/>
       </w:pPr>
       <w:r>
-        <w:t xml:space="preserve">The reactivation covers a personal kickoff text to each of the 12,950 inactive partners and every conversation that follows. The monthly figures keep all 13,000 partners on the two-week cadence. Texting is billed by HighLevel on 7FF’s own sub-account.</w:t>
+        <w:t xml:space="preserve">The reactivation covers a personal kickoff text to each of the 12,950 inactive partners and every conversation that follows. The monthly figures keep all 13,000 partners on the two-week cadence.</w:t>
       </w:r>
     </w:p>
     <w:bookmarkEnd w:id="13"/>
@@ -980,9 +910,6 @@
             <w:pPr>
               <w:pStyle w:val="Compact"/>
             </w:pPr>
-            <w:r>
-              <w:t xml:space="preserve">Florida</w:t>
-            </w:r>
           </w:p>
         </w:tc>
       </w:tr>

</xml_diff>